<commit_message>
Add inspection checklist workflow to patent documents
</commit_message>
<xml_diff>
--- a/docs/patent/의약품_비품관리_및_약제팀_라벨_통합시스템_특허제출자료.docx
+++ b/docs/patent/의약품_비품관리_및_약제팀_라벨_통합시스템_특허제출자료.docx
@@ -7720,6 +7720,248 @@
       </w:tr>
     </w:tbl>
     <w:p>
+      <w:pPr>
+        <w:pStyle w:val="Heading2"/>
+      </w:pPr>
+      <w:r>
+        <w:t>5.3 부서 버튼의 미점검·유예·완료 상태관리</w:t>
+      </w:r>
+    </w:p>
+    <w:p>
+      <w:pPr>
+        <w:keepNext/>
+        <w:jc w:val="center"/>
+      </w:pPr>
+      <w:r>
+        <w:drawing>
+          <wp:inline xmlns:a="http://schemas.openxmlformats.org/drawingml/2006/main" xmlns:pic="http://schemas.openxmlformats.org/drawingml/2006/picture">
+            <wp:extent cx="5257800" cy="5755907"/>
+            <wp:docPr id="13" name="Picture 13" descr="도 17. 순회점검 부서 버튼의 상태 전이 흐름도" title="도 17. 순회점검 부서 버튼의 상태 전이 흐름도"/>
+            <wp:cNvGraphicFramePr>
+              <a:graphicFrameLocks noChangeAspect="1"/>
+            </wp:cNvGraphicFramePr>
+            <a:graphic>
+              <a:graphicData uri="http://schemas.openxmlformats.org/drawingml/2006/picture">
+                <pic:pic>
+                  <pic:nvPicPr>
+                    <pic:cNvPr id="0" name="fig17_department_status_flow.png"/>
+                    <pic:cNvPicPr/>
+                  </pic:nvPicPr>
+                  <pic:blipFill>
+                    <a:blip r:embed="rId23"/>
+                    <a:stretch>
+                      <a:fillRect/>
+                    </a:stretch>
+                  </pic:blipFill>
+                  <pic:spPr>
+                    <a:xfrm>
+                      <a:off x="0" y="0"/>
+                      <a:ext cx="5257800" cy="5755907"/>
+                    </a:xfrm>
+                    <a:prstGeom prst="rect"/>
+                  </pic:spPr>
+                </pic:pic>
+              </a:graphicData>
+            </a:graphic>
+          </wp:inline>
+        </w:drawing>
+      </w:r>
+    </w:p>
+    <w:p>
+      <w:pPr>
+        <w:pStyle w:val="Caption"/>
+        <w:jc w:val="center"/>
+      </w:pPr>
+      <w:r>
+        <w:rPr>
+          <w:rFonts w:ascii="Malgun Gothic" w:hAnsi="Malgun Gothic" w:eastAsia="Malgun Gothic"/>
+          <w:b w:val="0"/>
+          <w:i w:val="0"/>
+          <w:color w:val="5B6570"/>
+          <w:sz w:val="17"/>
+        </w:rPr>
+        <w:t>도 17. 순회점검 부서 버튼의 상태 전이 흐름도</w:t>
+      </w:r>
+    </w:p>
+    <w:p>
+      <w:pPr>
+        <w:keepLines w:val="0"/>
+      </w:pPr>
+      <w:r>
+        <w:rPr>
+          <w:rFonts w:ascii="Malgun Gothic" w:hAnsi="Malgun Gothic" w:eastAsia="Malgun Gothic"/>
+          <w:b w:val="0"/>
+          <w:i w:val="0"/>
+          <w:color w:val="1F2933"/>
+          <w:sz w:val="21"/>
+        </w:rPr>
+        <w:t>순회점검 대상 부서는 미점검, 점검유예 및 점검완료의 상태값을 갖습니다. 부서목록 화면은 상태값을 서로 다른 버튼색으로 투영하여 점검한 병동과 미점검 부서를 즉시 구분합니다. 환자 검사·처치 등으로 바로 점검하기 어려운 부서를 더블 터치하면 점검유예 상태와 사유가 저장되고 버튼색이 유색 반전됩니다.</w:t>
+      </w:r>
+    </w:p>
+    <w:p>
+      <w:pPr>
+        <w:keepLines w:val="0"/>
+      </w:pPr>
+      <w:r>
+        <w:rPr>
+          <w:rFonts w:ascii="Malgun Gothic" w:hAnsi="Malgun Gothic" w:eastAsia="Malgun Gothic"/>
+          <w:b w:val="0"/>
+          <w:i w:val="0"/>
+          <w:color w:val="1F2933"/>
+          <w:sz w:val="21"/>
+        </w:rPr>
+        <w:t>점검유예 상태는 단순 화면 표시가 아니라 부서 식별자, 상태, 사유, 처리자 및 시각을 포함하는 상태 레코드입니다. 이후 해당 부서의 체크리스트를 저장하면 같은 트랜잭션에서 유예 상태를 해제하고 점검완료 상태·점검자·점검시각을 기록합니다. 부서 버튼은 완료색으로 바뀌고 미점검 부서 집계에서 제외됩니다.</w:t>
+      </w:r>
+    </w:p>
+    <w:p>
+      <w:pPr>
+        <w:pStyle w:val="Heading2"/>
+      </w:pPr>
+      <w:r>
+        <w:t>5.4 적합 기본값과 결과표 자동완성</w:t>
+      </w:r>
+    </w:p>
+    <w:p>
+      <w:pPr>
+        <w:keepNext/>
+        <w:jc w:val="center"/>
+      </w:pPr>
+      <w:r>
+        <w:drawing>
+          <wp:inline xmlns:a="http://schemas.openxmlformats.org/drawingml/2006/main" xmlns:pic="http://schemas.openxmlformats.org/drawingml/2006/picture">
+            <wp:extent cx="5257800" cy="5755907"/>
+            <wp:docPr id="14" name="Picture 14" descr="도 18. 체크리스트 예외·유효기간의 결과표 자동완성 흐름도" title="도 18. 체크리스트 예외·유효기간의 결과표 자동완성 흐름도"/>
+            <wp:cNvGraphicFramePr>
+              <a:graphicFrameLocks noChangeAspect="1"/>
+            </wp:cNvGraphicFramePr>
+            <a:graphic>
+              <a:graphicData uri="http://schemas.openxmlformats.org/drawingml/2006/picture">
+                <pic:pic>
+                  <pic:nvPicPr>
+                    <pic:cNvPr id="0" name="fig18_checklist_report_flow.png"/>
+                    <pic:cNvPicPr/>
+                  </pic:nvPicPr>
+                  <pic:blipFill>
+                    <a:blip r:embed="rId24"/>
+                    <a:stretch>
+                      <a:fillRect/>
+                    </a:stretch>
+                  </pic:blipFill>
+                  <pic:spPr>
+                    <a:xfrm>
+                      <a:off x="0" y="0"/>
+                      <a:ext cx="5257800" cy="5755907"/>
+                    </a:xfrm>
+                    <a:prstGeom prst="rect"/>
+                  </pic:spPr>
+                </pic:pic>
+              </a:graphicData>
+            </a:graphic>
+          </wp:inline>
+        </w:drawing>
+      </w:r>
+    </w:p>
+    <w:p>
+      <w:pPr>
+        <w:pStyle w:val="Caption"/>
+        <w:jc w:val="center"/>
+      </w:pPr>
+      <w:r>
+        <w:rPr>
+          <w:rFonts w:ascii="Malgun Gothic" w:hAnsi="Malgun Gothic" w:eastAsia="Malgun Gothic"/>
+          <w:b w:val="0"/>
+          <w:i w:val="0"/>
+          <w:color w:val="5B6570"/>
+          <w:sz w:val="17"/>
+        </w:rPr>
+        <w:t>도 18. 체크리스트 예외·유효기간의 결과표 자동완성 흐름도</w:t>
+      </w:r>
+    </w:p>
+    <w:p>
+      <w:pPr>
+        <w:keepLines w:val="0"/>
+      </w:pPr>
+      <w:r>
+        <w:rPr>
+          <w:rFonts w:ascii="Malgun Gothic" w:hAnsi="Malgun Gothic" w:eastAsia="Malgun Gothic"/>
+          <w:b w:val="0"/>
+          <w:i w:val="0"/>
+          <w:color w:val="1F2933"/>
+          <w:sz w:val="21"/>
+        </w:rPr>
+        <w:t>체크리스트를 열면 인증규정에 대응하는 점검항목을 적합으로 초기화합니다. 점검자는 개선이 필요한 항목만 ‘개선 필요’로 전환하고 필요한 사항·사유를 입력합니다. 시스템은 수동 개선항목을 순회점검 결과 레코드로 변환하므로 적합항목을 반복 입력하지 않아도 됩니다.</w:t>
+      </w:r>
+    </w:p>
+    <w:p>
+      <w:pPr>
+        <w:keepLines w:val="0"/>
+      </w:pPr>
+      <w:r>
+        <w:rPr>
+          <w:rFonts w:ascii="Malgun Gothic" w:hAnsi="Malgun Gothic" w:eastAsia="Malgun Gothic"/>
+          <w:b w:val="0"/>
+          <w:i w:val="0"/>
+          <w:color w:val="1F2933"/>
+          <w:sz w:val="21"/>
+        </w:rPr>
+        <w:t>의약품별 유효기간을 입력하거나 조회했을 때 기준일로부터 3개월 미만이면 별도의 유효기간 임박 예외를 자동 생성합니다. 수동 개선사항과 유효기간 자동 예외는 부서·약품·점검항목 식별키로 병합되고, 체크리스트 저장과 동시에 순회점검 결과표 및 보고서에 삽입됩니다. 실질 점검이 완료되면 부서상태, 예외내역과 보고서가 하나의 버전으로 완성됩니다.</w:t>
+      </w:r>
+    </w:p>
+    <w:tbl>
+      <w:tblPr>
+        <w:tblW w:type="dxa" w:w="9705"/>
+        <w:jc w:val="left"/>
+        <w:tblLayout w:type="fixed"/>
+        <w:tblLook w:firstColumn="1" w:firstRow="1" w:lastColumn="0" w:lastRow="0" w:noHBand="0" w:noVBand="1" w:val="04A0"/>
+        <w:tblInd w:w="120" w:type="dxa"/>
+        <w:tblBorders>
+          <w:top w:val="single" w:sz="8" w:color="315D7A"/>
+          <w:left w:val="single" w:sz="8" w:color="315D7A"/>
+          <w:bottom w:val="single" w:sz="8" w:color="315D7A"/>
+          <w:right w:val="single" w:sz="8" w:color="315D7A"/>
+          <w:insideH w:val="single" w:sz="8" w:color="315D7A"/>
+          <w:insideV w:val="single" w:sz="8" w:color="315D7A"/>
+        </w:tblBorders>
+      </w:tblPr>
+      <w:tblGrid>
+        <w:gridCol w:w="9705"/>
+      </w:tblGrid>
+      <w:tr>
+        <w:tc>
+          <w:tcPr>
+            <w:tcW w:type="dxa" w:w="9705"/>
+            <w:shd w:fill="EEF3F6"/>
+          </w:tcPr>
+          <w:p>
+            <w:pPr>
+              <w:spacing w:after="40"/>
+            </w:pPr>
+            <w:r/>
+            <w:r>
+              <w:rPr>
+                <w:rFonts w:ascii="Malgun Gothic" w:hAnsi="Malgun Gothic" w:eastAsia="Malgun Gothic"/>
+                <w:b/>
+                <w:i w:val="0"/>
+                <w:color w:val="315D7A"/>
+                <w:sz w:val="19"/>
+              </w:rPr>
+              <w:t xml:space="preserve">행정업무 경감의 기술적 근거  </w:t>
+            </w:r>
+            <w:r>
+              <w:rPr>
+                <w:rFonts w:ascii="Malgun Gothic" w:hAnsi="Malgun Gothic" w:eastAsia="Malgun Gothic"/>
+                <w:b w:val="0"/>
+                <w:i w:val="0"/>
+                <w:color w:val="1F2933"/>
+                <w:sz w:val="19"/>
+              </w:rPr>
+              <w:t>적합 기본값, 상태 전이, 수동 개선사항의 구조화, 3개월 미만 유효기간 판정 및 결과표 자동삽입을 하나의 저장 트랜잭션으로 결합하여 점검 후 결과보고서를 다시 작성하는 작업을 줄입니다.</w:t>
+            </w:r>
+          </w:p>
+        </w:tc>
+      </w:tr>
+    </w:tbl>
+    <w:p>
       <w:r>
         <w:br w:type="page"/>
       </w:r>
@@ -7741,7 +7983,7 @@
         <w:drawing>
           <wp:inline xmlns:a="http://schemas.openxmlformats.org/drawingml/2006/main" xmlns:pic="http://schemas.openxmlformats.org/drawingml/2006/picture">
             <wp:extent cx="5257800" cy="5534526"/>
-            <wp:docPr id="13" name="Picture 13" descr="도 4. 약제 라벨 규칙 결정 및 출력 흐름도" title="도 4. 약제 라벨 규칙 결정 및 출력 흐름도"/>
+            <wp:docPr id="15" name="Picture 15" descr="도 4. 약제 라벨 규칙 결정 및 출력 흐름도" title="도 4. 약제 라벨 규칙 결정 및 출력 흐름도"/>
             <wp:cNvGraphicFramePr>
               <a:graphicFrameLocks noChangeAspect="1"/>
             </wp:cNvGraphicFramePr>
@@ -7753,7 +7995,7 @@
                     <pic:cNvPicPr/>
                   </pic:nvPicPr>
                   <pic:blipFill>
-                    <a:blip r:embed="rId23"/>
+                    <a:blip r:embed="rId25"/>
                     <a:stretch>
                       <a:fillRect/>
                     </a:stretch>
@@ -8554,7 +8796,7 @@
         <w:drawing>
           <wp:inline xmlns:a="http://schemas.openxmlformats.org/drawingml/2006/main" xmlns:pic="http://schemas.openxmlformats.org/drawingml/2006/picture">
             <wp:extent cx="5257800" cy="5534526"/>
-            <wp:docPr id="14" name="Picture 14" descr="도 8. 권한 범위가 적용된 조회·편집·동기화 흐름도" title="도 8. 권한 범위가 적용된 조회·편집·동기화 흐름도"/>
+            <wp:docPr id="16" name="Picture 16" descr="도 8. 권한 범위가 적용된 조회·편집·동기화 흐름도" title="도 8. 권한 범위가 적용된 조회·편집·동기화 흐름도"/>
             <wp:cNvGraphicFramePr>
               <a:graphicFrameLocks noChangeAspect="1"/>
             </wp:cNvGraphicFramePr>
@@ -8566,7 +8808,7 @@
                     <pic:cNvPicPr/>
                   </pic:nvPicPr>
                   <pic:blipFill>
-                    <a:blip r:embed="rId24"/>
+                    <a:blip r:embed="rId26"/>
                     <a:stretch>
                       <a:fillRect/>
                     </a:stretch>
@@ -8648,7 +8890,7 @@
         <w:drawing>
           <wp:inline xmlns:a="http://schemas.openxmlformats.org/drawingml/2006/main" xmlns:pic="http://schemas.openxmlformats.org/drawingml/2006/picture">
             <wp:extent cx="5669280" cy="4535424"/>
-            <wp:docPr id="15" name="Picture 15" descr="도 5. 다중 단말 상태 동기화 및 충돌 처리 흐름도" title="도 5. 다중 단말 상태 동기화 및 충돌 처리 흐름도"/>
+            <wp:docPr id="17" name="Picture 17" descr="도 5. 다중 단말 상태 동기화 및 충돌 처리 흐름도" title="도 5. 다중 단말 상태 동기화 및 충돌 처리 흐름도"/>
             <wp:cNvGraphicFramePr>
               <a:graphicFrameLocks noChangeAspect="1"/>
             </wp:cNvGraphicFramePr>
@@ -8660,7 +8902,7 @@
                     <pic:cNvPicPr/>
                   </pic:nvPicPr>
                   <pic:blipFill>
-                    <a:blip r:embed="rId25"/>
+                    <a:blip r:embed="rId27"/>
                     <a:stretch>
                       <a:fillRect/>
                     </a:stretch>
@@ -8817,7 +9059,7 @@
         <w:drawing>
           <wp:inline xmlns:a="http://schemas.openxmlformats.org/drawingml/2006/main" xmlns:pic="http://schemas.openxmlformats.org/drawingml/2006/picture">
             <wp:extent cx="5897880" cy="3324260"/>
-            <wp:docPr id="16" name="Picture 16" descr="도 6. 약품코드를 중심으로 한 논리 데이터 모델" title="도 6. 약품코드를 중심으로 한 논리 데이터 모델"/>
+            <wp:docPr id="18" name="Picture 18" descr="도 6. 약품코드를 중심으로 한 논리 데이터 모델" title="도 6. 약품코드를 중심으로 한 논리 데이터 모델"/>
             <wp:cNvGraphicFramePr>
               <a:graphicFrameLocks noChangeAspect="1"/>
             </wp:cNvGraphicFramePr>
@@ -8829,7 +9071,7 @@
                     <pic:cNvPicPr/>
                   </pic:nvPicPr>
                   <pic:blipFill>
-                    <a:blip r:embed="rId26"/>
+                    <a:blip r:embed="rId28"/>
                     <a:stretch>
                       <a:fillRect/>
                     </a:stretch>
@@ -9675,6 +9917,29 @@
       </w:r>
     </w:p>
     <w:p>
+      <w:pPr>
+        <w:pStyle w:val="Heading2"/>
+      </w:pPr>
+      <w:r>
+        <w:t>9.7 점검유예와 결과표 자동완성 실시예</w:t>
+      </w:r>
+    </w:p>
+    <w:p>
+      <w:pPr>
+        <w:keepLines w:val="0"/>
+      </w:pPr>
+      <w:r>
+        <w:rPr>
+          <w:rFonts w:ascii="Malgun Gothic" w:hAnsi="Malgun Gothic" w:eastAsia="Malgun Gothic"/>
+          <w:b w:val="0"/>
+          <w:i w:val="0"/>
+          <w:color w:val="1F2933"/>
+          <w:sz w:val="21"/>
+        </w:rPr>
+        <w:t>점검자가 부서목록에서 병동 R2가 환자 검사로 즉시 점검하기 어려운 것을 확인하고 해당 버튼을 더블 터치하면, 시스템은 R2를 점검유예로 저장하고 버튼색을 반전합니다. 이후 R2의 체크리스트를 열면 모든 항목이 적합으로 초기화됩니다. 점검자는 보관상태 항목만 개선 필요로 전환하고 ‘냉장고 온도기록 보완’이라고 입력하며, 의약품 G의 유효기간을 입력합니다. G의 유효기간이 기준일로부터 3개월 미만이면 시스템은 유효기간 임박 예외를 추가합니다. 저장 시 R2의 유예표시는 해제되고 점검완료 상태로 바뀌며, 보관상태 개선사항과 G의 유효기간 임박정보가 순회점검 결과표와 PDF 보고서에 자동 삽입됩니다.</w:t>
+      </w:r>
+    </w:p>
+    <w:p>
       <w:r>
         <w:br w:type="page"/>
       </w:r>
@@ -10378,6 +10643,128 @@
                 <w:sz w:val="17"/>
               </w:rPr>
               <w:t>표준 라벨·객관식 체크리스트·예외결과·순회보고를 같은 마스터와 점검상태에서 생성함</w:t>
+            </w:r>
+          </w:p>
+        </w:tc>
+      </w:tr>
+      <w:tr>
+        <w:tc>
+          <w:tcPr>
+            <w:tcW w:type="dxa" w:w="1944"/>
+            <w:vAlign w:val="center"/>
+            <w:tcMar>
+              <w:top w:w="90" w:type="dxa"/>
+              <w:left w:w="120" w:type="dxa"/>
+              <w:bottom w:w="90" w:type="dxa"/>
+              <w:right w:w="120" w:type="dxa"/>
+            </w:tcMar>
+          </w:tcPr>
+          <w:p>
+            <w:pPr>
+              <w:spacing w:before="0" w:after="0" w:line="269" w:lineRule="auto"/>
+              <w:jc w:val="center"/>
+            </w:pPr>
+            <w:r/>
+            <w:r>
+              <w:rPr>
+                <w:rFonts w:ascii="Malgun Gothic" w:hAnsi="Malgun Gothic" w:eastAsia="Malgun Gothic"/>
+                <w:b w:val="0"/>
+                <w:i w:val="0"/>
+                <w:color w:val="1F2933"/>
+                <w:sz w:val="17"/>
+              </w:rPr>
+              <w:t>점검 진행 가시성</w:t>
+            </w:r>
+          </w:p>
+        </w:tc>
+        <w:tc>
+          <w:tcPr>
+            <w:tcW w:type="dxa" w:w="7761"/>
+            <w:vAlign w:val="center"/>
+            <w:tcMar>
+              <w:top w:w="90" w:type="dxa"/>
+              <w:left w:w="120" w:type="dxa"/>
+              <w:bottom w:w="90" w:type="dxa"/>
+              <w:right w:w="120" w:type="dxa"/>
+            </w:tcMar>
+          </w:tcPr>
+          <w:p>
+            <w:pPr>
+              <w:spacing w:before="0" w:after="0" w:line="269" w:lineRule="auto"/>
+              <w:jc w:val="left"/>
+            </w:pPr>
+            <w:r/>
+            <w:r>
+              <w:rPr>
+                <w:rFonts w:ascii="Malgun Gothic" w:hAnsi="Malgun Gothic" w:eastAsia="Malgun Gothic"/>
+                <w:b w:val="0"/>
+                <w:i w:val="0"/>
+                <w:color w:val="1F2933"/>
+                <w:sz w:val="17"/>
+              </w:rPr>
+              <w:t>부서별 미점검·유예·완료 상태를 서버 상태값과 버튼색에 매핑하고 체크리스트 저장 시 유예를 자동 해제함</w:t>
+            </w:r>
+          </w:p>
+        </w:tc>
+      </w:tr>
+      <w:tr>
+        <w:tc>
+          <w:tcPr>
+            <w:tcW w:type="dxa" w:w="1944"/>
+            <w:shd w:fill="F7F9FA"/>
+            <w:vAlign w:val="center"/>
+            <w:tcMar>
+              <w:top w:w="90" w:type="dxa"/>
+              <w:left w:w="120" w:type="dxa"/>
+              <w:bottom w:w="90" w:type="dxa"/>
+              <w:right w:w="120" w:type="dxa"/>
+            </w:tcMar>
+          </w:tcPr>
+          <w:p>
+            <w:pPr>
+              <w:spacing w:before="0" w:after="0" w:line="269" w:lineRule="auto"/>
+              <w:jc w:val="center"/>
+            </w:pPr>
+            <w:r/>
+            <w:r>
+              <w:rPr>
+                <w:rFonts w:ascii="Malgun Gothic" w:hAnsi="Malgun Gothic" w:eastAsia="Malgun Gothic"/>
+                <w:b w:val="0"/>
+                <w:i w:val="0"/>
+                <w:color w:val="1F2933"/>
+                <w:sz w:val="17"/>
+              </w:rPr>
+              <w:t>보고서 자동완성</w:t>
+            </w:r>
+          </w:p>
+        </w:tc>
+        <w:tc>
+          <w:tcPr>
+            <w:tcW w:type="dxa" w:w="7761"/>
+            <w:shd w:fill="F7F9FA"/>
+            <w:vAlign w:val="center"/>
+            <w:tcMar>
+              <w:top w:w="90" w:type="dxa"/>
+              <w:left w:w="120" w:type="dxa"/>
+              <w:bottom w:w="90" w:type="dxa"/>
+              <w:right w:w="120" w:type="dxa"/>
+            </w:tcMar>
+          </w:tcPr>
+          <w:p>
+            <w:pPr>
+              <w:spacing w:before="0" w:after="0" w:line="269" w:lineRule="auto"/>
+              <w:jc w:val="left"/>
+            </w:pPr>
+            <w:r/>
+            <w:r>
+              <w:rPr>
+                <w:rFonts w:ascii="Malgun Gothic" w:hAnsi="Malgun Gothic" w:eastAsia="Malgun Gothic"/>
+                <w:b w:val="0"/>
+                <w:i w:val="0"/>
+                <w:color w:val="1F2933"/>
+                <w:sz w:val="17"/>
+              </w:rPr>
+              <w:t>적합 기본값, 개선사항 입력 및 3개월 미만 유효기간 자동예외를 결과표와 보고서에 즉시 병합함</w:t>
             </w:r>
           </w:p>
         </w:tc>
@@ -10599,6 +10986,36 @@
           <w:sz w:val="20"/>
         </w:rPr>
         <w:t>약품유형별 표준 라벨과 대상별 객관식 체크리스트를 생성하고 현장 입력에서 예외·점검보고·PDF 증빙자료를 자동 생성하여 규칙에 환류하는 방식</w:t>
+      </w:r>
+    </w:p>
+    <w:p>
+      <w:pPr>
+        <w:pStyle w:val="ListBullet"/>
+      </w:pPr>
+      <w:r>
+        <w:rPr>
+          <w:rFonts w:ascii="Malgun Gothic" w:hAnsi="Malgun Gothic" w:eastAsia="Malgun Gothic"/>
+          <w:b w:val="0"/>
+          <w:i w:val="0"/>
+          <w:color w:val="1F2933"/>
+          <w:sz w:val="20"/>
+        </w:rPr>
+        <w:t>부서별 점검상태를 미점검·점검유예·점검완료로 관리하고 더블 터치와 체크리스트 저장 이벤트에 따라 상태·버튼색·미점검 집계를 함께 전이하는 방식</w:t>
+      </w:r>
+    </w:p>
+    <w:p>
+      <w:pPr>
+        <w:pStyle w:val="ListBullet"/>
+      </w:pPr>
+      <w:r>
+        <w:rPr>
+          <w:rFonts w:ascii="Malgun Gothic" w:hAnsi="Malgun Gothic" w:eastAsia="Malgun Gothic"/>
+          <w:b w:val="0"/>
+          <w:i w:val="0"/>
+          <w:color w:val="1F2933"/>
+          <w:sz w:val="20"/>
+        </w:rPr>
+        <w:t>체크리스트를 적합으로 초기화한 뒤 개선필요 항목과 3개월 미만 유효기간 예외만 구조화하여 결과표·보고서를 자동완성하는 방식</w:t>
       </w:r>
     </w:p>
     <w:tbl>
@@ -10869,6 +11286,36 @@
           <w:sz w:val="20"/>
         </w:rPr>
         <w:t>비품약, E-cart, 마약류, 일반수액 또는 처치청구약의 업무영역별 표준 라벨과 체크리스트를 생성하고 현장 점검결과로부터 예외와 순회점검 증빙자료를 생성하는 표준화·점검 폐루프 처리부(1510~1570);</w:t>
+      </w:r>
+    </w:p>
+    <w:p>
+      <w:pPr>
+        <w:pStyle w:val="ListBullet"/>
+      </w:pPr>
+      <w:r>
+        <w:rPr>
+          <w:rFonts w:ascii="Malgun Gothic" w:hAnsi="Malgun Gothic" w:eastAsia="Malgun Gothic"/>
+          <w:b w:val="0"/>
+          <w:i w:val="0"/>
+          <w:color w:val="1F2933"/>
+          <w:sz w:val="20"/>
+        </w:rPr>
+        <w:t>부서별 점검상태를 미점검, 점검유예 또는 점검완료로 저장하고, 더블 터치 이벤트에 따라 점검유예 상태와 유예사유를 저장하며 체크리스트 저장 이벤트에 따라 유예상태를 해제하고 점검완료 상태로 전환하는 부서상태 처리부(1710~1750);</w:t>
+      </w:r>
+    </w:p>
+    <w:p>
+      <w:pPr>
+        <w:pStyle w:val="ListBullet"/>
+      </w:pPr>
+      <w:r>
+        <w:rPr>
+          <w:rFonts w:ascii="Malgun Gothic" w:hAnsi="Malgun Gothic" w:eastAsia="Malgun Gothic"/>
+          <w:b w:val="0"/>
+          <w:i w:val="0"/>
+          <w:color w:val="1F2933"/>
+          <w:sz w:val="20"/>
+        </w:rPr>
+        <w:t>체크리스트 항목을 적합으로 초기화하고 개선필요 선택과 필요사항을 예외 레코드로 변환하며 기준일로부터 3개월 미만인 의약품 유효기간을 자동 예외로 생성하여 순회점검 결과표와 보고서에 삽입하는 결과표 자동완성부(1810~1860);</w:t>
       </w:r>
     </w:p>
     <w:p>
@@ -11102,6 +11549,36 @@
           <w:sz w:val="20"/>
         </w:rPr>
         <w:t>업무영역별 표준 라벨과 객관식 체크리스트를 생성하고 현장 입력에서 예외·점검보고·PDF 증빙자료를 생성하는 단계;</w:t>
+      </w:r>
+    </w:p>
+    <w:p>
+      <w:pPr>
+        <w:pStyle w:val="ListNumber"/>
+      </w:pPr>
+      <w:r>
+        <w:rPr>
+          <w:rFonts w:ascii="Malgun Gothic" w:hAnsi="Malgun Gothic" w:eastAsia="Malgun Gothic"/>
+          <w:b w:val="0"/>
+          <w:i w:val="0"/>
+          <w:color w:val="1F2933"/>
+          <w:sz w:val="20"/>
+        </w:rPr>
+        <w:t>부서별 미점검·점검유예·점검완료 상태를 버튼색으로 표시하고 더블 터치에 따라 점검유예 상태를 저장하며 체크리스트 저장 시 유예상태를 해제하고 점검완료로 전환하는 단계;</w:t>
+      </w:r>
+    </w:p>
+    <w:p>
+      <w:pPr>
+        <w:pStyle w:val="ListNumber"/>
+      </w:pPr>
+      <w:r>
+        <w:rPr>
+          <w:rFonts w:ascii="Malgun Gothic" w:hAnsi="Malgun Gothic" w:eastAsia="Malgun Gothic"/>
+          <w:b w:val="0"/>
+          <w:i w:val="0"/>
+          <w:color w:val="1F2933"/>
+          <w:sz w:val="20"/>
+        </w:rPr>
+        <w:t>체크리스트를 적합으로 초기화하고 개선필요 항목과 필요사항을 결과 레코드로 변환하며 기준일로부터 3개월 미만인 유효기간을 자동 예외로 생성하여 결과표와 보고서에 삽입하는 단계;</w:t>
       </w:r>
     </w:p>
     <w:p>
@@ -11428,6 +11905,36 @@
       </w:r>
     </w:p>
     <w:p>
+      <w:pPr>
+        <w:pStyle w:val="ListBullet"/>
+      </w:pPr>
+      <w:r>
+        <w:rPr>
+          <w:rFonts w:ascii="Malgun Gothic" w:hAnsi="Malgun Gothic" w:eastAsia="Malgun Gothic"/>
+          <w:b w:val="0"/>
+          <w:i w:val="0"/>
+          <w:color w:val="1F2933"/>
+          <w:sz w:val="20"/>
+        </w:rPr>
+        <w:t>부서 버튼의 더블 터치로 점검유예 상태와 유예사유를 저장하고 체크리스트 완료 저장 시 유예표시를 해제하여 점검완료 색상으로 전환하는 구성</w:t>
+      </w:r>
+    </w:p>
+    <w:p>
+      <w:pPr>
+        <w:pStyle w:val="ListBullet"/>
+      </w:pPr>
+      <w:r>
+        <w:rPr>
+          <w:rFonts w:ascii="Malgun Gothic" w:hAnsi="Malgun Gothic" w:eastAsia="Malgun Gothic"/>
+          <w:b w:val="0"/>
+          <w:i w:val="0"/>
+          <w:color w:val="1F2933"/>
+          <w:sz w:val="20"/>
+        </w:rPr>
+        <w:t>체크리스트 적합 기본값에서 개선필요 항목만 입력받고 3개월 미만 유효기간을 자동 판정하여 결과표·보고서에 자동삽입하는 구성</w:t>
+      </w:r>
+    </w:p>
+    <w:p>
       <w:r>
         <w:br w:type="page"/>
       </w:r>
@@ -12497,6 +13004,128 @@
                 <w:sz w:val="17"/>
               </w:rPr>
               <w:t>병동 표준화·점검 계층과 약제팀 라벨 작업실 및 역할별 뷰어를 공통 마스터·공동 서버로 연결한 종합 블록도</w:t>
+            </w:r>
+          </w:p>
+        </w:tc>
+      </w:tr>
+      <w:tr>
+        <w:tc>
+          <w:tcPr>
+            <w:tcW w:type="dxa" w:w="1296"/>
+            <w:vAlign w:val="center"/>
+            <w:tcMar>
+              <w:top w:w="90" w:type="dxa"/>
+              <w:left w:w="120" w:type="dxa"/>
+              <w:bottom w:w="90" w:type="dxa"/>
+              <w:right w:w="120" w:type="dxa"/>
+            </w:tcMar>
+          </w:tcPr>
+          <w:p>
+            <w:pPr>
+              <w:spacing w:before="0" w:after="0" w:line="269" w:lineRule="auto"/>
+              <w:jc w:val="center"/>
+            </w:pPr>
+            <w:r/>
+            <w:r>
+              <w:rPr>
+                <w:rFonts w:ascii="Malgun Gothic" w:hAnsi="Malgun Gothic" w:eastAsia="Malgun Gothic"/>
+                <w:b w:val="0"/>
+                <w:i w:val="0"/>
+                <w:color w:val="1F2933"/>
+                <w:sz w:val="17"/>
+              </w:rPr>
+              <w:t>도 17</w:t>
+            </w:r>
+          </w:p>
+        </w:tc>
+        <w:tc>
+          <w:tcPr>
+            <w:tcW w:type="dxa" w:w="8409"/>
+            <w:vAlign w:val="center"/>
+            <w:tcMar>
+              <w:top w:w="90" w:type="dxa"/>
+              <w:left w:w="120" w:type="dxa"/>
+              <w:bottom w:w="90" w:type="dxa"/>
+              <w:right w:w="120" w:type="dxa"/>
+            </w:tcMar>
+          </w:tcPr>
+          <w:p>
+            <w:pPr>
+              <w:spacing w:before="0" w:after="0" w:line="269" w:lineRule="auto"/>
+              <w:jc w:val="left"/>
+            </w:pPr>
+            <w:r/>
+            <w:r>
+              <w:rPr>
+                <w:rFonts w:ascii="Malgun Gothic" w:hAnsi="Malgun Gothic" w:eastAsia="Malgun Gothic"/>
+                <w:b w:val="0"/>
+                <w:i w:val="0"/>
+                <w:color w:val="1F2933"/>
+                <w:sz w:val="17"/>
+              </w:rPr>
+              <w:t>부서별 미점검·점검유예·점검완료 상태의 표시와 더블 터치·체크리스트 저장에 따른 상태 전이 흐름도</w:t>
+            </w:r>
+          </w:p>
+        </w:tc>
+      </w:tr>
+      <w:tr>
+        <w:tc>
+          <w:tcPr>
+            <w:tcW w:type="dxa" w:w="1296"/>
+            <w:shd w:fill="F7F9FA"/>
+            <w:vAlign w:val="center"/>
+            <w:tcMar>
+              <w:top w:w="90" w:type="dxa"/>
+              <w:left w:w="120" w:type="dxa"/>
+              <w:bottom w:w="90" w:type="dxa"/>
+              <w:right w:w="120" w:type="dxa"/>
+            </w:tcMar>
+          </w:tcPr>
+          <w:p>
+            <w:pPr>
+              <w:spacing w:before="0" w:after="0" w:line="269" w:lineRule="auto"/>
+              <w:jc w:val="center"/>
+            </w:pPr>
+            <w:r/>
+            <w:r>
+              <w:rPr>
+                <w:rFonts w:ascii="Malgun Gothic" w:hAnsi="Malgun Gothic" w:eastAsia="Malgun Gothic"/>
+                <w:b w:val="0"/>
+                <w:i w:val="0"/>
+                <w:color w:val="1F2933"/>
+                <w:sz w:val="17"/>
+              </w:rPr>
+              <w:t>도 18</w:t>
+            </w:r>
+          </w:p>
+        </w:tc>
+        <w:tc>
+          <w:tcPr>
+            <w:tcW w:type="dxa" w:w="8409"/>
+            <w:shd w:fill="F7F9FA"/>
+            <w:vAlign w:val="center"/>
+            <w:tcMar>
+              <w:top w:w="90" w:type="dxa"/>
+              <w:left w:w="120" w:type="dxa"/>
+              <w:bottom w:w="90" w:type="dxa"/>
+              <w:right w:w="120" w:type="dxa"/>
+            </w:tcMar>
+          </w:tcPr>
+          <w:p>
+            <w:pPr>
+              <w:spacing w:before="0" w:after="0" w:line="269" w:lineRule="auto"/>
+              <w:jc w:val="left"/>
+            </w:pPr>
+            <w:r/>
+            <w:r>
+              <w:rPr>
+                <w:rFonts w:ascii="Malgun Gothic" w:hAnsi="Malgun Gothic" w:eastAsia="Malgun Gothic"/>
+                <w:b w:val="0"/>
+                <w:i w:val="0"/>
+                <w:color w:val="1F2933"/>
+                <w:sz w:val="17"/>
+              </w:rPr>
+              <w:t>적합 기본값, 개선필요 입력, 3개월 미만 유효기간 판정 및 결과표·보고서 자동완성 흐름도</w:t>
             </w:r>
           </w:p>
         </w:tc>
@@ -15534,6 +16163,242 @@
           </w:p>
         </w:tc>
       </w:tr>
+      <w:tr>
+        <w:tc>
+          <w:tcPr>
+            <w:tcW w:type="dxa" w:w="835"/>
+            <w:vAlign w:val="center"/>
+            <w:tcMar>
+              <w:top w:w="90" w:type="dxa"/>
+              <w:left w:w="120" w:type="dxa"/>
+              <w:bottom w:w="90" w:type="dxa"/>
+              <w:right w:w="120" w:type="dxa"/>
+            </w:tcMar>
+          </w:tcPr>
+          <w:p>
+            <w:pPr>
+              <w:spacing w:before="0" w:after="0" w:line="269" w:lineRule="auto"/>
+              <w:jc w:val="center"/>
+            </w:pPr>
+            <w:r/>
+            <w:r>
+              <w:rPr>
+                <w:rFonts w:ascii="Malgun Gothic" w:hAnsi="Malgun Gothic" w:eastAsia="Malgun Gothic"/>
+                <w:b w:val="0"/>
+                <w:i w:val="0"/>
+                <w:color w:val="1F2933"/>
+                <w:sz w:val="16"/>
+              </w:rPr>
+              <w:t>1710~1750</w:t>
+            </w:r>
+          </w:p>
+        </w:tc>
+        <w:tc>
+          <w:tcPr>
+            <w:tcW w:type="dxa" w:w="4017"/>
+            <w:vAlign w:val="center"/>
+            <w:tcMar>
+              <w:top w:w="90" w:type="dxa"/>
+              <w:left w:w="120" w:type="dxa"/>
+              <w:bottom w:w="90" w:type="dxa"/>
+              <w:right w:w="120" w:type="dxa"/>
+            </w:tcMar>
+          </w:tcPr>
+          <w:p>
+            <w:pPr>
+              <w:spacing w:before="0" w:after="0" w:line="269" w:lineRule="auto"/>
+              <w:jc w:val="left"/>
+            </w:pPr>
+            <w:r/>
+            <w:r>
+              <w:rPr>
+                <w:rFonts w:ascii="Malgun Gothic" w:hAnsi="Malgun Gothic" w:eastAsia="Malgun Gothic"/>
+                <w:b w:val="0"/>
+                <w:i w:val="0"/>
+                <w:color w:val="1F2933"/>
+                <w:sz w:val="16"/>
+              </w:rPr>
+              <w:t>부서 점검상태 전이 처리부</w:t>
+            </w:r>
+          </w:p>
+        </w:tc>
+        <w:tc>
+          <w:tcPr>
+            <w:tcW w:type="dxa" w:w="835"/>
+            <w:vAlign w:val="center"/>
+            <w:tcMar>
+              <w:top w:w="90" w:type="dxa"/>
+              <w:left w:w="120" w:type="dxa"/>
+              <w:bottom w:w="90" w:type="dxa"/>
+              <w:right w:w="120" w:type="dxa"/>
+            </w:tcMar>
+          </w:tcPr>
+          <w:p>
+            <w:pPr>
+              <w:spacing w:before="0" w:after="0" w:line="269" w:lineRule="auto"/>
+              <w:jc w:val="left"/>
+            </w:pPr>
+            <w:r/>
+            <w:r>
+              <w:rPr>
+                <w:rFonts w:ascii="Malgun Gothic" w:hAnsi="Malgun Gothic" w:eastAsia="Malgun Gothic"/>
+                <w:b w:val="0"/>
+                <w:i w:val="0"/>
+                <w:color w:val="1F2933"/>
+                <w:sz w:val="16"/>
+              </w:rPr>
+            </w:r>
+          </w:p>
+        </w:tc>
+        <w:tc>
+          <w:tcPr>
+            <w:tcW w:type="dxa" w:w="4017"/>
+            <w:vAlign w:val="center"/>
+            <w:tcMar>
+              <w:top w:w="90" w:type="dxa"/>
+              <w:left w:w="120" w:type="dxa"/>
+              <w:bottom w:w="90" w:type="dxa"/>
+              <w:right w:w="120" w:type="dxa"/>
+            </w:tcMar>
+          </w:tcPr>
+          <w:p>
+            <w:pPr>
+              <w:spacing w:before="0" w:after="0" w:line="269" w:lineRule="auto"/>
+              <w:jc w:val="left"/>
+            </w:pPr>
+            <w:r/>
+            <w:r>
+              <w:rPr>
+                <w:rFonts w:ascii="Malgun Gothic" w:hAnsi="Malgun Gothic" w:eastAsia="Malgun Gothic"/>
+                <w:b w:val="0"/>
+                <w:i w:val="0"/>
+                <w:color w:val="1F2933"/>
+                <w:sz w:val="16"/>
+              </w:rPr>
+            </w:r>
+          </w:p>
+        </w:tc>
+      </w:tr>
+      <w:tr>
+        <w:tc>
+          <w:tcPr>
+            <w:tcW w:type="dxa" w:w="835"/>
+            <w:shd w:fill="F7F9FA"/>
+            <w:vAlign w:val="center"/>
+            <w:tcMar>
+              <w:top w:w="90" w:type="dxa"/>
+              <w:left w:w="120" w:type="dxa"/>
+              <w:bottom w:w="90" w:type="dxa"/>
+              <w:right w:w="120" w:type="dxa"/>
+            </w:tcMar>
+          </w:tcPr>
+          <w:p>
+            <w:pPr>
+              <w:spacing w:before="0" w:after="0" w:line="269" w:lineRule="auto"/>
+              <w:jc w:val="center"/>
+            </w:pPr>
+            <w:r/>
+            <w:r>
+              <w:rPr>
+                <w:rFonts w:ascii="Malgun Gothic" w:hAnsi="Malgun Gothic" w:eastAsia="Malgun Gothic"/>
+                <w:b w:val="0"/>
+                <w:i w:val="0"/>
+                <w:color w:val="1F2933"/>
+                <w:sz w:val="16"/>
+              </w:rPr>
+              <w:t>1810~1860</w:t>
+            </w:r>
+          </w:p>
+        </w:tc>
+        <w:tc>
+          <w:tcPr>
+            <w:tcW w:type="dxa" w:w="4017"/>
+            <w:shd w:fill="F7F9FA"/>
+            <w:vAlign w:val="center"/>
+            <w:tcMar>
+              <w:top w:w="90" w:type="dxa"/>
+              <w:left w:w="120" w:type="dxa"/>
+              <w:bottom w:w="90" w:type="dxa"/>
+              <w:right w:w="120" w:type="dxa"/>
+            </w:tcMar>
+          </w:tcPr>
+          <w:p>
+            <w:pPr>
+              <w:spacing w:before="0" w:after="0" w:line="269" w:lineRule="auto"/>
+              <w:jc w:val="left"/>
+            </w:pPr>
+            <w:r/>
+            <w:r>
+              <w:rPr>
+                <w:rFonts w:ascii="Malgun Gothic" w:hAnsi="Malgun Gothic" w:eastAsia="Malgun Gothic"/>
+                <w:b w:val="0"/>
+                <w:i w:val="0"/>
+                <w:color w:val="1F2933"/>
+                <w:sz w:val="16"/>
+              </w:rPr>
+              <w:t>체크리스트·결과표 자동완성 처리부</w:t>
+            </w:r>
+          </w:p>
+        </w:tc>
+        <w:tc>
+          <w:tcPr>
+            <w:tcW w:type="dxa" w:w="835"/>
+            <w:shd w:fill="F7F9FA"/>
+            <w:vAlign w:val="center"/>
+            <w:tcMar>
+              <w:top w:w="90" w:type="dxa"/>
+              <w:left w:w="120" w:type="dxa"/>
+              <w:bottom w:w="90" w:type="dxa"/>
+              <w:right w:w="120" w:type="dxa"/>
+            </w:tcMar>
+          </w:tcPr>
+          <w:p>
+            <w:pPr>
+              <w:spacing w:before="0" w:after="0" w:line="269" w:lineRule="auto"/>
+              <w:jc w:val="left"/>
+            </w:pPr>
+            <w:r/>
+            <w:r>
+              <w:rPr>
+                <w:rFonts w:ascii="Malgun Gothic" w:hAnsi="Malgun Gothic" w:eastAsia="Malgun Gothic"/>
+                <w:b w:val="0"/>
+                <w:i w:val="0"/>
+                <w:color w:val="1F2933"/>
+                <w:sz w:val="16"/>
+              </w:rPr>
+            </w:r>
+          </w:p>
+        </w:tc>
+        <w:tc>
+          <w:tcPr>
+            <w:tcW w:type="dxa" w:w="4017"/>
+            <w:shd w:fill="F7F9FA"/>
+            <w:vAlign w:val="center"/>
+            <w:tcMar>
+              <w:top w:w="90" w:type="dxa"/>
+              <w:left w:w="120" w:type="dxa"/>
+              <w:bottom w:w="90" w:type="dxa"/>
+              <w:right w:w="120" w:type="dxa"/>
+            </w:tcMar>
+          </w:tcPr>
+          <w:p>
+            <w:pPr>
+              <w:spacing w:before="0" w:after="0" w:line="269" w:lineRule="auto"/>
+              <w:jc w:val="left"/>
+            </w:pPr>
+            <w:r/>
+            <w:r>
+              <w:rPr>
+                <w:rFonts w:ascii="Malgun Gothic" w:hAnsi="Malgun Gothic" w:eastAsia="Malgun Gothic"/>
+                <w:b w:val="0"/>
+                <w:i w:val="0"/>
+                <w:color w:val="1F2933"/>
+                <w:sz w:val="16"/>
+              </w:rPr>
+            </w:r>
+          </w:p>
+        </w:tc>
+      </w:tr>
     </w:tbl>
     <w:p>
       <w:r>
@@ -15596,7 +16461,7 @@
                 <w:color w:val="1F2933"/>
                 <w:sz w:val="19"/>
               </w:rPr>
-              <w:t>본 발명은 의약품 마스터의 변경과 실 배정을 병원 약제 업무 데이터에 자동 전파하는 통합 시스템 및 방법에 관한 것입니다. 시스템은 약제팀 보유약품목록 Excel을 단일 운영 원천으로 사용하면서 행 변경을 통합 마스터에 반영하고 앱에서 승인한 변경도 해당 Excel에 기록합니다. 마스터 저장 명령은 신규, 속성 변경, 분류 변경 또는 식별코드 변경으로 판정되고 종속성 그래프로 영향객체가 산정됩니다. 또한 실, 약품 및 수량의 1회 배정으로 방-약품 배치관계를 생성하고, 이를 공통 생성원인으로 전체 약품목록, 해당 실 약품목록, 실별 라벨 및 마약류 LOT 입력키를 함께 생성합니다. 병동용·약제팀용 라벨은 공통 필드와 업무영역별 개별 필드를 분리하여 공동 또는 선택적으로 갱신됩니다. 모든 결과는 하나의 버전으로 커밋되고 PC와 모바일에 동기화되어 기존 Excel 방식의 다중 파일·다단계 입력과 부분 반영을 줄입니다.</w:t>
+              <w:t>본 발명은 의약품 마스터의 변경과 실 배정을 병원 약제 업무 데이터에 자동 전파하는 통합 시스템 및 방법에 관한 것입니다. 시스템은 약제팀 보유약품목록 Excel을 단일 운영 원천으로 사용하면서 행 변경과 앱 승인 변경을 양방향 반영합니다. 실·약품·수량의 1회 배정은 전체 약품목록, 실별 목록·라벨 및 마약류 LOT 입력키를 함께 생성하며, 병동용·약제팀용 라벨은 공통 필드와 개별 필드를 분리하여 갱신됩니다. 순회점검에서는 부서상태를 미점검·점검유예·점검완료로 관리하고 더블 터치로 유예표시를 저장한 뒤 체크리스트 완료 시 자동 해제합니다. 체크리스트는 적합을 기본값으로 하여 개선필요 항목과 3개월 미만 유효기간 예외만 결과 레코드로 생성하고 순회점검 결과표와 보고서를 자동완성합니다. 모든 결과는 하나의 버전으로 커밋되어 역할별 PC와 모바일에 동기화됩니다.</w:t>
             </w:r>
           </w:p>
         </w:tc>
@@ -16562,7 +17427,7 @@
     <w:sectPr>
       <w:headerReference w:type="default" r:id="rId9"/>
       <w:footerReference w:type="default" r:id="rId10"/>
-      <w:pgSz w:w="12240" w:h="15840"/>
+      <w:pgSz w:w="11906" w:h="16838"/>
       <w:pgMar w:top="1123" w:right="1181" w:bottom="1037" w:left="1181" w:header="504" w:footer="504" w:gutter="0"/>
       <w:cols w:space="720"/>
       <w:docGrid w:linePitch="360"/>

</xml_diff>

<commit_message>
Expand patent specification with LOT location and label workflows
</commit_message>
<xml_diff>
--- a/docs/patent/의약품_비품관리_및_약제팀_라벨_통합시스템_특허제출자료.docx
+++ b/docs/patent/의약품_비품관리_및_약제팀_라벨_통합시스템_특허제출자료.docx
@@ -28,11 +28,11 @@
           <w:b/>
           <w:i w:val="0"/>
           <w:color w:val="18324A"/>
-          <w:sz w:val="46"/>
+          <w:sz w:val="40"/>
         </w:rPr>
-        <w:t>단일 약품 원천·원스톱 실 배정과 업무영역별 라벨 정책을 이용한</w:t>
+        <w:t>의약품 마스터·비치 약품 보유 실 배정·업무영역별 약품 라벨자동 생성 및</w:t>
         <w:br/>
-        <w:t>병원 약제 표준화·점검 통합 데이터 처리 시스템</w:t>
+        <w:t>점검 증빙의 자동 전파와 역할 기반 동기화를 수행하는 병원 약제 업무 통합 시스템 및 방법</w:t>
       </w:r>
     </w:p>
     <w:p>
@@ -126,7 +126,7 @@
                 <w:color w:val="1F2933"/>
                 <w:sz w:val="18"/>
               </w:rPr>
-              <w:t>약제팀 Excel 단일 원천, 원스톱 실 배정, 업무영역별 라벨 및 점검 증빙의 자동 전파를 수행하는 병원 약제 업무 통합 시스템 및 방법</w:t>
+              <w:t>의약품 마스터·비치 약품 보유 실 배정·업무영역별 약품 라벨자동 생성 및 점검 증빙의 자동 전파와 역할 기반 동기화를 수행하는 병원 약제 업무 통합 시스템 및 방법</w:t>
             </w:r>
           </w:p>
         </w:tc>
@@ -2078,6 +2078,188 @@
           </w:p>
         </w:tc>
       </w:tr>
+      <w:tr>
+        <w:tc>
+          <w:tcPr>
+            <w:tcW w:type="dxa" w:w="2131"/>
+            <w:vAlign w:val="center"/>
+            <w:tcMar>
+              <w:top w:w="90" w:type="dxa"/>
+              <w:left w:w="120" w:type="dxa"/>
+              <w:bottom w:w="90" w:type="dxa"/>
+              <w:right w:w="120" w:type="dxa"/>
+            </w:tcMar>
+          </w:tcPr>
+          <w:p>
+            <w:pPr>
+              <w:spacing w:before="0" w:after="0" w:line="269" w:lineRule="auto"/>
+              <w:jc w:val="center"/>
+            </w:pPr>
+            <w:r/>
+            <w:r>
+              <w:rPr>
+                <w:rFonts w:ascii="Malgun Gothic" w:hAnsi="Malgun Gothic" w:eastAsia="Malgun Gothic"/>
+                <w:b w:val="0"/>
+                <w:i w:val="0"/>
+                <w:color w:val="1F2933"/>
+                <w:sz w:val="17"/>
+              </w:rPr>
+              <w:t>LOT 점검 누락</w:t>
+            </w:r>
+          </w:p>
+        </w:tc>
+        <w:tc>
+          <w:tcPr>
+            <w:tcW w:type="dxa" w:w="7574"/>
+            <w:vAlign w:val="center"/>
+            <w:tcMar>
+              <w:top w:w="90" w:type="dxa"/>
+              <w:left w:w="120" w:type="dxa"/>
+              <w:bottom w:w="90" w:type="dxa"/>
+              <w:right w:w="120" w:type="dxa"/>
+            </w:tcMar>
+          </w:tcPr>
+          <w:p>
+            <w:pPr>
+              <w:spacing w:before="0" w:after="0" w:line="269" w:lineRule="auto"/>
+              <w:jc w:val="left"/>
+            </w:pPr>
+            <w:r/>
+            <w:r>
+              <w:rPr>
+                <w:rFonts w:ascii="Malgun Gothic" w:hAnsi="Malgun Gothic" w:eastAsia="Malgun Gothic"/>
+                <w:b w:val="0"/>
+                <w:i w:val="0"/>
+                <w:color w:val="1F2933"/>
+                <w:sz w:val="17"/>
+              </w:rPr>
+              <w:t>점검 실 상태를 확인하지 않고 LOT만 기록하면 미점검·유예 실과 실제 LOT 불일치를 식별하기 어려움</w:t>
+            </w:r>
+          </w:p>
+        </w:tc>
+      </w:tr>
+      <w:tr>
+        <w:tc>
+          <w:tcPr>
+            <w:tcW w:type="dxa" w:w="2131"/>
+            <w:shd w:fill="F7F9FA"/>
+            <w:vAlign w:val="center"/>
+            <w:tcMar>
+              <w:top w:w="90" w:type="dxa"/>
+              <w:left w:w="120" w:type="dxa"/>
+              <w:bottom w:w="90" w:type="dxa"/>
+              <w:right w:w="120" w:type="dxa"/>
+            </w:tcMar>
+          </w:tcPr>
+          <w:p>
+            <w:pPr>
+              <w:spacing w:before="0" w:after="0" w:line="269" w:lineRule="auto"/>
+              <w:jc w:val="center"/>
+            </w:pPr>
+            <w:r/>
+            <w:r>
+              <w:rPr>
+                <w:rFonts w:ascii="Malgun Gothic" w:hAnsi="Malgun Gothic" w:eastAsia="Malgun Gothic"/>
+                <w:b w:val="0"/>
+                <w:i w:val="0"/>
+                <w:color w:val="1F2933"/>
+                <w:sz w:val="17"/>
+              </w:rPr>
+              <w:t>라벨 파일 비검색성</w:t>
+            </w:r>
+          </w:p>
+        </w:tc>
+        <w:tc>
+          <w:tcPr>
+            <w:tcW w:type="dxa" w:w="7574"/>
+            <w:shd w:fill="F7F9FA"/>
+            <w:vAlign w:val="center"/>
+            <w:tcMar>
+              <w:top w:w="90" w:type="dxa"/>
+              <w:left w:w="120" w:type="dxa"/>
+              <w:bottom w:w="90" w:type="dxa"/>
+              <w:right w:w="120" w:type="dxa"/>
+            </w:tcMar>
+          </w:tcPr>
+          <w:p>
+            <w:pPr>
+              <w:spacing w:before="0" w:after="0" w:line="269" w:lineRule="auto"/>
+              <w:jc w:val="left"/>
+            </w:pPr>
+            <w:r/>
+            <w:r>
+              <w:rPr>
+                <w:rFonts w:ascii="Malgun Gothic" w:hAnsi="Malgun Gothic" w:eastAsia="Malgun Gothic"/>
+                <w:b w:val="0"/>
+                <w:i w:val="0"/>
+                <w:color w:val="1F2933"/>
+                <w:sz w:val="17"/>
+              </w:rPr>
+              <w:t>변경 때마다 도안을 새로 만들고 담당자별 파일로 쌓으면 약품별 최신 라벨을 검색하기 어려움</w:t>
+            </w:r>
+          </w:p>
+        </w:tc>
+      </w:tr>
+      <w:tr>
+        <w:tc>
+          <w:tcPr>
+            <w:tcW w:type="dxa" w:w="2131"/>
+            <w:vAlign w:val="center"/>
+            <w:tcMar>
+              <w:top w:w="90" w:type="dxa"/>
+              <w:left w:w="120" w:type="dxa"/>
+              <w:bottom w:w="90" w:type="dxa"/>
+              <w:right w:w="120" w:type="dxa"/>
+            </w:tcMar>
+          </w:tcPr>
+          <w:p>
+            <w:pPr>
+              <w:spacing w:before="0" w:after="0" w:line="269" w:lineRule="auto"/>
+              <w:jc w:val="center"/>
+            </w:pPr>
+            <w:r/>
+            <w:r>
+              <w:rPr>
+                <w:rFonts w:ascii="Malgun Gothic" w:hAnsi="Malgun Gothic" w:eastAsia="Malgun Gothic"/>
+                <w:b w:val="0"/>
+                <w:i w:val="0"/>
+                <w:color w:val="1F2933"/>
+                <w:sz w:val="17"/>
+              </w:rPr>
+              <w:t>위치정보 단절</w:t>
+            </w:r>
+          </w:p>
+        </w:tc>
+        <w:tc>
+          <w:tcPr>
+            <w:tcW w:type="dxa" w:w="7574"/>
+            <w:vAlign w:val="center"/>
+            <w:tcMar>
+              <w:top w:w="90" w:type="dxa"/>
+              <w:left w:w="120" w:type="dxa"/>
+              <w:bottom w:w="90" w:type="dxa"/>
+              <w:right w:w="120" w:type="dxa"/>
+            </w:tcMar>
+          </w:tcPr>
+          <w:p>
+            <w:pPr>
+              <w:spacing w:before="0" w:after="0" w:line="269" w:lineRule="auto"/>
+              <w:jc w:val="left"/>
+            </w:pPr>
+            <w:r/>
+            <w:r>
+              <w:rPr>
+                <w:rFonts w:ascii="Malgun Gothic" w:hAnsi="Malgun Gothic" w:eastAsia="Malgun Gothic"/>
+                <w:b w:val="0"/>
+                <w:i w:val="0"/>
+                <w:color w:val="1F2933"/>
+                <w:sz w:val="17"/>
+              </w:rPr>
+              <w:t>보유 실과 약품장·선반·구획 위치를 구별하지 않으면 라벨과 위치별 목록에서 정확한 보관장소를 특정하기 어려움</w:t>
+            </w:r>
+          </w:p>
+        </w:tc>
+      </w:tr>
     </w:tbl>
     <w:p>
       <w:pPr>
@@ -2220,6 +2402,66 @@
           <w:sz w:val="20"/>
         </w:rPr>
         <w:t>인증된 역할에 따라 화면, 조회 객체, 필드 및 편집 명령을 결정하고, 서버가 허용 범위를 벗어난 요청을 거부한 뒤 허용된 변경만 공동 상태에 반영합니다.</w:t>
+      </w:r>
+    </w:p>
+    <w:p>
+      <w:pPr>
+        <w:pStyle w:val="ListNumber"/>
+      </w:pPr>
+      <w:r>
+        <w:rPr>
+          <w:rFonts w:ascii="Malgun Gothic" w:hAnsi="Malgun Gothic" w:eastAsia="Malgun Gothic"/>
+          <w:b w:val="0"/>
+          <w:i w:val="0"/>
+          <w:color w:val="1F2933"/>
+          <w:sz w:val="20"/>
+        </w:rPr>
+        <w:t>점검 대상 실 버튼으로 완료·미점검·유예와 누락 부서를 먼저 확인한 뒤 내려받은 마약류 예상 LOT와 현장 실제 LOT·수량·유효기간을 대조합니다.</w:t>
+      </w:r>
+    </w:p>
+    <w:p>
+      <w:pPr>
+        <w:pStyle w:val="ListNumber"/>
+      </w:pPr>
+      <w:r>
+        <w:rPr>
+          <w:rFonts w:ascii="Malgun Gothic" w:hAnsi="Malgun Gothic" w:eastAsia="Malgun Gothic"/>
+          <w:b w:val="0"/>
+          <w:i w:val="0"/>
+          <w:color w:val="1F2933"/>
+          <w:sz w:val="20"/>
+        </w:rPr>
+        <w:t>보유 실과 구별되는 보관장소 고유기호를 약품코드와 연결하여 위치표시 라벨, 위치별 약품장 목록과 양방향 검색을 자동 생성합니다.</w:t>
+      </w:r>
+    </w:p>
+    <w:p>
+      <w:pPr>
+        <w:pStyle w:val="ListNumber"/>
+      </w:pPr>
+      <w:r>
+        <w:rPr>
+          <w:rFonts w:ascii="Malgun Gothic" w:hAnsi="Malgun Gothic" w:eastAsia="Malgun Gothic"/>
+          <w:b w:val="0"/>
+          <w:i w:val="0"/>
+          <w:color w:val="1F2933"/>
+          <w:sz w:val="20"/>
+        </w:rPr>
+        <w:t>라벨 최종본을 버전 객체로 저장하고 검색 시 최신 최종본의 자유편집영역을 유지하면서 최신 마스터 종속필드를 재주입합니다.</w:t>
+      </w:r>
+    </w:p>
+    <w:p>
+      <w:pPr>
+        <w:pStyle w:val="ListNumber"/>
+      </w:pPr>
+      <w:r>
+        <w:rPr>
+          <w:rFonts w:ascii="Malgun Gothic" w:hAnsi="Malgun Gothic" w:eastAsia="Malgun Gothic"/>
+          <w:b w:val="0"/>
+          <w:i w:val="0"/>
+          <w:color w:val="1F2933"/>
+          <w:sz w:val="20"/>
+        </w:rPr>
+        <w:t>앱 빌드와 업무 데이터의 버전을 분리하여 역할별 PC·모바일에 배포하고 이중 백업에서 직전 호환 버전으로 복구합니다.</w:t>
       </w:r>
     </w:p>
     <w:p>
@@ -7962,6 +8204,154 @@
       </w:tr>
     </w:tbl>
     <w:p>
+      <w:pPr>
+        <w:pStyle w:val="Heading2"/>
+      </w:pPr>
+      <w:r>
+        <w:t>5.5 점검 대상 실 확인 후 마약류 LOT 실재고 대조</w:t>
+      </w:r>
+    </w:p>
+    <w:p>
+      <w:pPr>
+        <w:keepNext/>
+        <w:jc w:val="center"/>
+      </w:pPr>
+      <w:r>
+        <w:drawing>
+          <wp:inline xmlns:a="http://schemas.openxmlformats.org/drawingml/2006/main" xmlns:pic="http://schemas.openxmlformats.org/drawingml/2006/picture">
+            <wp:extent cx="5257800" cy="7194884"/>
+            <wp:docPr id="15" name="Picture 15" descr="도 19. 점검 대상 실 상태 확인과 마약류 보유 LOT 동기화·실재고 대조 흐름도" title="도 19. 점검 대상 실 상태 확인과 마약류 보유 LOT 동기화·실재고 대조 흐름도"/>
+            <wp:cNvGraphicFramePr>
+              <a:graphicFrameLocks noChangeAspect="1"/>
+            </wp:cNvGraphicFramePr>
+            <a:graphic>
+              <a:graphicData uri="http://schemas.openxmlformats.org/drawingml/2006/picture">
+                <pic:pic>
+                  <pic:nvPicPr>
+                    <pic:cNvPr id="0" name="fig19_narcotic_lot_reconciliation.png"/>
+                    <pic:cNvPicPr/>
+                  </pic:nvPicPr>
+                  <pic:blipFill>
+                    <a:blip r:embed="rId25"/>
+                    <a:stretch>
+                      <a:fillRect/>
+                    </a:stretch>
+                  </pic:blipFill>
+                  <pic:spPr>
+                    <a:xfrm>
+                      <a:off x="0" y="0"/>
+                      <a:ext cx="5257800" cy="7194884"/>
+                    </a:xfrm>
+                    <a:prstGeom prst="rect"/>
+                  </pic:spPr>
+                </pic:pic>
+              </a:graphicData>
+            </a:graphic>
+          </wp:inline>
+        </w:drawing>
+      </w:r>
+    </w:p>
+    <w:p>
+      <w:pPr>
+        <w:pStyle w:val="Caption"/>
+        <w:jc w:val="center"/>
+      </w:pPr>
+      <w:r>
+        <w:rPr>
+          <w:rFonts w:ascii="Malgun Gothic" w:hAnsi="Malgun Gothic" w:eastAsia="Malgun Gothic"/>
+          <w:b w:val="0"/>
+          <w:i w:val="0"/>
+          <w:color w:val="5B6570"/>
+          <w:sz w:val="17"/>
+        </w:rPr>
+        <w:t>도 19. 점검 대상 실 상태 확인과 마약류 보유 LOT 동기화·실재고 대조 흐름도</w:t>
+      </w:r>
+    </w:p>
+    <w:p>
+      <w:pPr>
+        <w:keepLines w:val="0"/>
+      </w:pPr>
+      <w:r>
+        <w:rPr>
+          <w:rFonts w:ascii="Malgun Gothic" w:hAnsi="Malgun Gothic" w:eastAsia="Malgun Gothic"/>
+          <w:b w:val="0"/>
+          <w:i w:val="0"/>
+          <w:color w:val="1F2933"/>
+          <w:sz w:val="21"/>
+        </w:rPr>
+        <w:t>마약류 LOT 확인에 앞서 전체 점검 대상 실의 버튼을 점검완료·미점검·점검유예 상태로 집계합니다. 점검자는 미점검·유예 필터와 누락 부서 목록에서 LOT 점검이 수행되지 않은 실을 먼저 특정합니다. 따라서 LOT 자료만 입력되고 해당 실의 현장점검이 빠지는 상태를 구별할 수 있습니다.</w:t>
+      </w:r>
+    </w:p>
+    <w:p>
+      <w:pPr>
+        <w:keepLines w:val="0"/>
+      </w:pPr>
+      <w:r>
+        <w:rPr>
+          <w:rFonts w:ascii="Malgun Gothic" w:hAnsi="Malgun Gothic" w:eastAsia="Malgun Gothic"/>
+          <w:b w:val="0"/>
+          <w:i w:val="0"/>
+          <w:color w:val="1F2933"/>
+          <w:sz w:val="21"/>
+        </w:rPr>
+        <w:t>마약류 연계 프로그램에서 내려받은 실별 보유재고 Excel은 기준시점, 시트 및 필수 열을 검증한 뒤 실ID·약품코드·LOT번호를 업무키로 정규화합니다. 예상수량과 유효기간을 멱등 갱신하고, 현장에서 확인한 실제 LOT·수량·유효기간과 비교하여 누락 LOT, 추가 LOT, 수량 차이 및 유효기간 임박·경과 예외를 생성합니다. 확인자·시각·원본 기준시점과 예외는 순회점검 결과표와 감사이력에 자동 반영됩니다.</w:t>
+      </w:r>
+    </w:p>
+    <w:tbl>
+      <w:tblPr>
+        <w:tblW w:type="dxa" w:w="9705"/>
+        <w:jc w:val="left"/>
+        <w:tblLayout w:type="fixed"/>
+        <w:tblLook w:firstColumn="1" w:firstRow="1" w:lastColumn="0" w:lastRow="0" w:noHBand="0" w:noVBand="1" w:val="04A0"/>
+        <w:tblInd w:w="120" w:type="dxa"/>
+        <w:tblBorders>
+          <w:top w:val="single" w:sz="8" w:color="315D7A"/>
+          <w:left w:val="single" w:sz="8" w:color="315D7A"/>
+          <w:bottom w:val="single" w:sz="8" w:color="315D7A"/>
+          <w:right w:val="single" w:sz="8" w:color="315D7A"/>
+          <w:insideH w:val="single" w:sz="8" w:color="315D7A"/>
+          <w:insideV w:val="single" w:sz="8" w:color="315D7A"/>
+        </w:tblBorders>
+      </w:tblPr>
+      <w:tblGrid>
+        <w:gridCol w:w="9705"/>
+      </w:tblGrid>
+      <w:tr>
+        <w:tc>
+          <w:tcPr>
+            <w:tcW w:type="dxa" w:w="9705"/>
+            <w:shd w:fill="EEF3F6"/>
+          </w:tcPr>
+          <w:p>
+            <w:pPr>
+              <w:spacing w:after="40"/>
+            </w:pPr>
+            <w:r/>
+            <w:r>
+              <w:rPr>
+                <w:rFonts w:ascii="Malgun Gothic" w:hAnsi="Malgun Gothic" w:eastAsia="Malgun Gothic"/>
+                <w:b/>
+                <w:i w:val="0"/>
+                <w:color w:val="315D7A"/>
+                <w:sz w:val="19"/>
+              </w:rPr>
+              <w:t xml:space="preserve">종래 업무와의 차이  </w:t>
+            </w:r>
+            <w:r>
+              <w:rPr>
+                <w:rFonts w:ascii="Malgun Gothic" w:hAnsi="Malgun Gothic" w:eastAsia="Malgun Gothic"/>
+                <w:b w:val="0"/>
+                <w:i w:val="0"/>
+                <w:color w:val="1F2933"/>
+                <w:sz w:val="19"/>
+              </w:rPr>
+              <w:t>유효기간 임박 약품의 교환이나 서명 중심의 점검기록을 넘어, 점검 누락 실 확인과 시점별 예상 LOT-실재고 LOT 대조를 하나의 점검 식별자로 연결하여 세부 증빙을 남깁니다.</w:t>
+            </w:r>
+          </w:p>
+        </w:tc>
+      </w:tr>
+    </w:tbl>
+    <w:p>
       <w:r>
         <w:br w:type="page"/>
       </w:r>
@@ -7983,7 +8373,7 @@
         <w:drawing>
           <wp:inline xmlns:a="http://schemas.openxmlformats.org/drawingml/2006/main" xmlns:pic="http://schemas.openxmlformats.org/drawingml/2006/picture">
             <wp:extent cx="5257800" cy="5534526"/>
-            <wp:docPr id="15" name="Picture 15" descr="도 4. 약제 라벨 규칙 결정 및 출력 흐름도" title="도 4. 약제 라벨 규칙 결정 및 출력 흐름도"/>
+            <wp:docPr id="16" name="Picture 16" descr="도 4. 약제 라벨 규칙 결정 및 출력 흐름도" title="도 4. 약제 라벨 규칙 결정 및 출력 흐름도"/>
             <wp:cNvGraphicFramePr>
               <a:graphicFrameLocks noChangeAspect="1"/>
             </wp:cNvGraphicFramePr>
@@ -7995,7 +8385,7 @@
                     <pic:cNvPicPr/>
                   </pic:nvPicPr>
                   <pic:blipFill>
-                    <a:blip r:embed="rId25"/>
+                    <a:blip r:embed="rId26"/>
                     <a:stretch>
                       <a:fillRect/>
                     </a:stretch>
@@ -8775,6 +9165,164 @@
       </w:r>
     </w:p>
     <w:p>
+      <w:pPr>
+        <w:pStyle w:val="Heading2"/>
+      </w:pPr>
+      <w:r>
+        <w:t>6.4 보관장소 고유기호 기반 라벨·위치목록</w:t>
+      </w:r>
+    </w:p>
+    <w:p>
+      <w:pPr>
+        <w:keepNext/>
+        <w:jc w:val="center"/>
+      </w:pPr>
+      <w:r>
+        <w:drawing>
+          <wp:inline xmlns:a="http://schemas.openxmlformats.org/drawingml/2006/main" xmlns:pic="http://schemas.openxmlformats.org/drawingml/2006/picture">
+            <wp:extent cx="5989320" cy="3693414"/>
+            <wp:docPr id="17" name="Picture 17" descr="도 20. 보관장소 고유기호 기반 라벨·위치별 약품장 목록 연동 블록도" title="도 20. 보관장소 고유기호 기반 라벨·위치별 약품장 목록 연동 블록도"/>
+            <wp:cNvGraphicFramePr>
+              <a:graphicFrameLocks noChangeAspect="1"/>
+            </wp:cNvGraphicFramePr>
+            <a:graphic>
+              <a:graphicData uri="http://schemas.openxmlformats.org/drawingml/2006/picture">
+                <pic:pic>
+                  <pic:nvPicPr>
+                    <pic:cNvPr id="0" name="fig20_location_symbol_linkage.png"/>
+                    <pic:cNvPicPr/>
+                  </pic:nvPicPr>
+                  <pic:blipFill>
+                    <a:blip r:embed="rId27"/>
+                    <a:stretch>
+                      <a:fillRect/>
+                    </a:stretch>
+                  </pic:blipFill>
+                  <pic:spPr>
+                    <a:xfrm>
+                      <a:off x="0" y="0"/>
+                      <a:ext cx="5989320" cy="3693414"/>
+                    </a:xfrm>
+                    <a:prstGeom prst="rect"/>
+                  </pic:spPr>
+                </pic:pic>
+              </a:graphicData>
+            </a:graphic>
+          </wp:inline>
+        </w:drawing>
+      </w:r>
+    </w:p>
+    <w:p>
+      <w:pPr>
+        <w:pStyle w:val="Caption"/>
+        <w:jc w:val="center"/>
+      </w:pPr>
+      <w:r>
+        <w:rPr>
+          <w:rFonts w:ascii="Malgun Gothic" w:hAnsi="Malgun Gothic" w:eastAsia="Malgun Gothic"/>
+          <w:b w:val="0"/>
+          <w:i w:val="0"/>
+          <w:color w:val="5B6570"/>
+          <w:sz w:val="17"/>
+        </w:rPr>
+        <w:t>도 20. 보관장소 고유기호 기반 라벨·위치별 약품장 목록 연동 블록도</w:t>
+      </w:r>
+    </w:p>
+    <w:p>
+      <w:pPr>
+        <w:keepLines w:val="0"/>
+      </w:pPr>
+      <w:r>
+        <w:rPr>
+          <w:rFonts w:ascii="Malgun Gothic" w:hAnsi="Malgun Gothic" w:eastAsia="Malgun Gothic"/>
+          <w:b w:val="0"/>
+          <w:i w:val="0"/>
+          <w:color w:val="1F2933"/>
+          <w:sz w:val="21"/>
+        </w:rPr>
+        <w:t>여기서 보관장소 고유기호는 ‘보유 실’과 다른 개념입니다. 보유 실 안의 약품장·선반·구획을 바로 특정하는 기호를 약품코드와 연결하고, 이 관계에서 위치표시 라벨, 고유기호별 약품장 목록, 약품에서 위치를 찾는 검색 및 위치에서 약품을 찾는 역검색을 함께 생성합니다. 위치가 바뀌면 마스터 화면의 관계를 한 번 수정하여 종속 라벨·목록·검색색인을 같은 버전으로 갱신합니다.</w:t>
+      </w:r>
+    </w:p>
+    <w:p>
+      <w:pPr>
+        <w:pStyle w:val="Heading2"/>
+      </w:pPr>
+      <w:r>
+        <w:t>6.5 라벨 최종본 저장·재주입·검색</w:t>
+      </w:r>
+    </w:p>
+    <w:p>
+      <w:pPr>
+        <w:keepNext/>
+        <w:jc w:val="center"/>
+      </w:pPr>
+      <w:r>
+        <w:drawing>
+          <wp:inline xmlns:a="http://schemas.openxmlformats.org/drawingml/2006/main" xmlns:pic="http://schemas.openxmlformats.org/drawingml/2006/picture">
+            <wp:extent cx="5257800" cy="5645217"/>
+            <wp:docPr id="18" name="Picture 18" descr="도 21. 라벨 최종본 저장·최신 마스터 정보 재주입·검색 흐름도" title="도 21. 라벨 최종본 저장·최신 마스터 정보 재주입·검색 흐름도"/>
+            <wp:cNvGraphicFramePr>
+              <a:graphicFrameLocks noChangeAspect="1"/>
+            </wp:cNvGraphicFramePr>
+            <a:graphic>
+              <a:graphicData uri="http://schemas.openxmlformats.org/drawingml/2006/picture">
+                <pic:pic>
+                  <pic:nvPicPr>
+                    <pic:cNvPr id="0" name="fig21_label_final_version_search.png"/>
+                    <pic:cNvPicPr/>
+                  </pic:nvPicPr>
+                  <pic:blipFill>
+                    <a:blip r:embed="rId28"/>
+                    <a:stretch>
+                      <a:fillRect/>
+                    </a:stretch>
+                  </pic:blipFill>
+                  <pic:spPr>
+                    <a:xfrm>
+                      <a:off x="0" y="0"/>
+                      <a:ext cx="5257800" cy="5645217"/>
+                    </a:xfrm>
+                    <a:prstGeom prst="rect"/>
+                  </pic:spPr>
+                </pic:pic>
+              </a:graphicData>
+            </a:graphic>
+          </wp:inline>
+        </w:drawing>
+      </w:r>
+    </w:p>
+    <w:p>
+      <w:pPr>
+        <w:pStyle w:val="Caption"/>
+        <w:jc w:val="center"/>
+      </w:pPr>
+      <w:r>
+        <w:rPr>
+          <w:rFonts w:ascii="Malgun Gothic" w:hAnsi="Malgun Gothic" w:eastAsia="Malgun Gothic"/>
+          <w:b w:val="0"/>
+          <w:i w:val="0"/>
+          <w:color w:val="5B6570"/>
+          <w:sz w:val="17"/>
+        </w:rPr>
+        <w:t>도 21. 라벨 최종본 저장·최신 마스터 정보 재주입·검색 흐름도</w:t>
+      </w:r>
+    </w:p>
+    <w:p>
+      <w:pPr>
+        <w:keepLines w:val="0"/>
+      </w:pPr>
+      <w:r>
+        <w:rPr>
+          <w:rFonts w:ascii="Malgun Gothic" w:hAnsi="Malgun Gothic" w:eastAsia="Malgun Gothic"/>
+          <w:b w:val="0"/>
+          <w:i w:val="0"/>
+          <w:color w:val="1F2933"/>
+          <w:sz w:val="21"/>
+        </w:rPr>
+        <w:t>라벨을 최종본으로 저장하면 labelId, 약품코드, 보관장소 고유기호, 라벨유형, 저장시각 및 마스터버전을 버전 레코드로 보존합니다. 후속 검색은 최신 유효 최종본을 우선 표시하며, 사용자가 조정한 자유편집영역은 유지하되 약품명·규격·제조사·보관조건·주의정보와 같은 마스터 종속필드는 최신 값으로 재주입합니다. 담당자별 파일을 하나씩 열지 않고 약품코드로 최신 라벨을 검색할 수 있습니다.</w:t>
+      </w:r>
+    </w:p>
+    <w:p>
       <w:r>
         <w:br w:type="page"/>
       </w:r>
@@ -8796,7 +9344,7 @@
         <w:drawing>
           <wp:inline xmlns:a="http://schemas.openxmlformats.org/drawingml/2006/main" xmlns:pic="http://schemas.openxmlformats.org/drawingml/2006/picture">
             <wp:extent cx="5257800" cy="5534526"/>
-            <wp:docPr id="16" name="Picture 16" descr="도 8. 권한 범위가 적용된 조회·편집·동기화 흐름도" title="도 8. 권한 범위가 적용된 조회·편집·동기화 흐름도"/>
+            <wp:docPr id="19" name="Picture 19" descr="도 8. 권한 범위가 적용된 조회·편집·동기화 흐름도" title="도 8. 권한 범위가 적용된 조회·편집·동기화 흐름도"/>
             <wp:cNvGraphicFramePr>
               <a:graphicFrameLocks noChangeAspect="1"/>
             </wp:cNvGraphicFramePr>
@@ -8808,7 +9356,7 @@
                     <pic:cNvPicPr/>
                   </pic:nvPicPr>
                   <pic:blipFill>
-                    <a:blip r:embed="rId26"/>
+                    <a:blip r:embed="rId29"/>
                     <a:stretch>
                       <a:fillRect/>
                     </a:stretch>
@@ -8890,7 +9438,7 @@
         <w:drawing>
           <wp:inline xmlns:a="http://schemas.openxmlformats.org/drawingml/2006/main" xmlns:pic="http://schemas.openxmlformats.org/drawingml/2006/picture">
             <wp:extent cx="5669280" cy="4535424"/>
-            <wp:docPr id="17" name="Picture 17" descr="도 5. 다중 단말 상태 동기화 및 충돌 처리 흐름도" title="도 5. 다중 단말 상태 동기화 및 충돌 처리 흐름도"/>
+            <wp:docPr id="20" name="Picture 20" descr="도 5. 다중 단말 상태 동기화 및 충돌 처리 흐름도" title="도 5. 다중 단말 상태 동기화 및 충돌 처리 흐름도"/>
             <wp:cNvGraphicFramePr>
               <a:graphicFrameLocks noChangeAspect="1"/>
             </wp:cNvGraphicFramePr>
@@ -8902,7 +9450,7 @@
                     <pic:cNvPicPr/>
                   </pic:nvPicPr>
                   <pic:blipFill>
-                    <a:blip r:embed="rId27"/>
+                    <a:blip r:embed="rId30"/>
                     <a:stretch>
                       <a:fillRect/>
                     </a:stretch>
@@ -9038,6 +9586,85 @@
       </w:tr>
     </w:tbl>
     <w:p>
+      <w:pPr>
+        <w:pStyle w:val="Heading2"/>
+      </w:pPr>
+      <w:r>
+        <w:t>7.4 링크 배포·역할별 버전 동기화·이중 백업</w:t>
+      </w:r>
+    </w:p>
+    <w:p>
+      <w:pPr>
+        <w:keepNext/>
+        <w:jc w:val="center"/>
+      </w:pPr>
+      <w:r>
+        <w:drawing>
+          <wp:inline xmlns:a="http://schemas.openxmlformats.org/drawingml/2006/main" xmlns:pic="http://schemas.openxmlformats.org/drawingml/2006/picture">
+            <wp:extent cx="5989320" cy="3693414"/>
+            <wp:docPr id="21" name="Picture 21" descr="도 22. 역할별 뷰어 배포·버전 동기화·이중 백업 블록도" title="도 22. 역할별 뷰어 배포·버전 동기화·이중 백업 블록도"/>
+            <wp:cNvGraphicFramePr>
+              <a:graphicFrameLocks noChangeAspect="1"/>
+            </wp:cNvGraphicFramePr>
+            <a:graphic>
+              <a:graphicData uri="http://schemas.openxmlformats.org/drawingml/2006/picture">
+                <pic:pic>
+                  <pic:nvPicPr>
+                    <pic:cNvPr id="0" name="fig22_distribution_backup.png"/>
+                    <pic:cNvPicPr/>
+                  </pic:nvPicPr>
+                  <pic:blipFill>
+                    <a:blip r:embed="rId31"/>
+                    <a:stretch>
+                      <a:fillRect/>
+                    </a:stretch>
+                  </pic:blipFill>
+                  <pic:spPr>
+                    <a:xfrm>
+                      <a:off x="0" y="0"/>
+                      <a:ext cx="5989320" cy="3693414"/>
+                    </a:xfrm>
+                    <a:prstGeom prst="rect"/>
+                  </pic:spPr>
+                </pic:pic>
+              </a:graphicData>
+            </a:graphic>
+          </wp:inline>
+        </w:drawing>
+      </w:r>
+    </w:p>
+    <w:p>
+      <w:pPr>
+        <w:pStyle w:val="Caption"/>
+        <w:jc w:val="center"/>
+      </w:pPr>
+      <w:r>
+        <w:rPr>
+          <w:rFonts w:ascii="Malgun Gothic" w:hAnsi="Malgun Gothic" w:eastAsia="Malgun Gothic"/>
+          <w:b w:val="0"/>
+          <w:i w:val="0"/>
+          <w:color w:val="5B6570"/>
+          <w:sz w:val="17"/>
+        </w:rPr>
+        <w:t>도 22. 역할별 뷰어 배포·버전 동기화·이중 백업 블록도</w:t>
+      </w:r>
+    </w:p>
+    <w:p>
+      <w:pPr>
+        <w:keepLines w:val="0"/>
+      </w:pPr>
+      <w:r>
+        <w:rPr>
+          <w:rFonts w:ascii="Malgun Gothic" w:hAnsi="Malgun Gothic" w:eastAsia="Malgun Gothic"/>
+          <w:b w:val="0"/>
+          <w:i w:val="0"/>
+          <w:color w:val="1F2933"/>
+          <w:sz w:val="21"/>
+        </w:rPr>
+        <w:t>애플리케이션 빌드 버전과 업무 데이터 버전을 분리하여 배포 저장소와 공동 클라우드 서버에 기록합니다. 관리자·편집권한 뷰어·조회전용 뷰어는 PC와 모바일에서 권한필터를 거친 버전 또는 해시를 수신하며, 생성·수정 내용은 새 커밋 알림으로 자동 갱신됩니다. 서버 스냅샷과 원본·생성자료는 분리 백업하고 검증 실패 시 직전 유효 버전의 호환쌍으로 복구합니다. GitHub는 링크 배포 저장소의 한 실시예로 기재하되 청구범위는 특정 서비스에 한정하지 않습니다.</w:t>
+      </w:r>
+    </w:p>
+    <w:p>
       <w:r>
         <w:br w:type="page"/>
       </w:r>
@@ -9059,7 +9686,7 @@
         <w:drawing>
           <wp:inline xmlns:a="http://schemas.openxmlformats.org/drawingml/2006/main" xmlns:pic="http://schemas.openxmlformats.org/drawingml/2006/picture">
             <wp:extent cx="5897880" cy="3324260"/>
-            <wp:docPr id="18" name="Picture 18" descr="도 6. 약품코드를 중심으로 한 논리 데이터 모델" title="도 6. 약품코드를 중심으로 한 논리 데이터 모델"/>
+            <wp:docPr id="22" name="Picture 22" descr="도 6. 약품코드를 중심으로 한 논리 데이터 모델" title="도 6. 약품코드를 중심으로 한 논리 데이터 모델"/>
             <wp:cNvGraphicFramePr>
               <a:graphicFrameLocks noChangeAspect="1"/>
             </wp:cNvGraphicFramePr>
@@ -9071,7 +9698,7 @@
                     <pic:cNvPicPr/>
                   </pic:nvPicPr>
                   <pic:blipFill>
-                    <a:blip r:embed="rId28"/>
+                    <a:blip r:embed="rId32"/>
                     <a:stretch>
                       <a:fillRect/>
                     </a:stretch>
@@ -9706,6 +10333,85 @@
       </w:tr>
     </w:tbl>
     <w:p>
+      <w:pPr>
+        <w:pStyle w:val="Heading2"/>
+      </w:pPr>
+      <w:r>
+        <w:t>8.3 카메라 라벨인식 기반 위치검색 확장</w:t>
+      </w:r>
+    </w:p>
+    <w:p>
+      <w:pPr>
+        <w:keepNext/>
+        <w:jc w:val="center"/>
+      </w:pPr>
+      <w:r>
+        <w:drawing>
+          <wp:inline xmlns:a="http://schemas.openxmlformats.org/drawingml/2006/main" xmlns:pic="http://schemas.openxmlformats.org/drawingml/2006/picture">
+            <wp:extent cx="5257800" cy="5755907"/>
+            <wp:docPr id="23" name="Picture 23" descr="도 23. 카메라 라벨인식 기반 보관장소 검색 확장 흐름도" title="도 23. 카메라 라벨인식 기반 보관장소 검색 확장 흐름도"/>
+            <wp:cNvGraphicFramePr>
+              <a:graphicFrameLocks noChangeAspect="1"/>
+            </wp:cNvGraphicFramePr>
+            <a:graphic>
+              <a:graphicData uri="http://schemas.openxmlformats.org/drawingml/2006/picture">
+                <pic:pic>
+                  <pic:nvPicPr>
+                    <pic:cNvPr id="0" name="fig23_camera_location_search.png"/>
+                    <pic:cNvPicPr/>
+                  </pic:nvPicPr>
+                  <pic:blipFill>
+                    <a:blip r:embed="rId33"/>
+                    <a:stretch>
+                      <a:fillRect/>
+                    </a:stretch>
+                  </pic:blipFill>
+                  <pic:spPr>
+                    <a:xfrm>
+                      <a:off x="0" y="0"/>
+                      <a:ext cx="5257800" cy="5755907"/>
+                    </a:xfrm>
+                    <a:prstGeom prst="rect"/>
+                  </pic:spPr>
+                </pic:pic>
+              </a:graphicData>
+            </a:graphic>
+          </wp:inline>
+        </w:drawing>
+      </w:r>
+    </w:p>
+    <w:p>
+      <w:pPr>
+        <w:pStyle w:val="Caption"/>
+        <w:jc w:val="center"/>
+      </w:pPr>
+      <w:r>
+        <w:rPr>
+          <w:rFonts w:ascii="Malgun Gothic" w:hAnsi="Malgun Gothic" w:eastAsia="Malgun Gothic"/>
+          <w:b w:val="0"/>
+          <w:i w:val="0"/>
+          <w:color w:val="5B6570"/>
+          <w:sz w:val="17"/>
+        </w:rPr>
+        <w:t>도 23. 카메라 라벨인식 기반 보관장소 검색 확장 흐름도</w:t>
+      </w:r>
+    </w:p>
+    <w:p>
+      <w:pPr>
+        <w:keepLines w:val="0"/>
+      </w:pPr>
+      <w:r>
+        <w:rPr>
+          <w:rFonts w:ascii="Malgun Gothic" w:hAnsi="Malgun Gothic" w:eastAsia="Malgun Gothic"/>
+          <w:b w:val="0"/>
+          <w:i w:val="0"/>
+          <w:color w:val="1F2933"/>
+          <w:sz w:val="21"/>
+        </w:rPr>
+        <w:t>향후 확장 실시예로 모바일 카메라가 약품 라벨의 약품명·규격·제조사 후보문자열을 인식하고, 정규화된 문자열을 마스터의 명칭·별칭·규격과 비교하여 신뢰도와 후보목록을 산출할 수 있습니다. 확정된 약품코드로 기존 약품코드-보관장소 고유기호 관계를 조회하여 약품장·선반·구획을 표시합니다. 별도 위치 데이터베이스를 만들지 않고 현재 구축한 위치관계를 재사용하는 점을 실시가능하게 기재하되, 개발 중 기능이므로 핵심 독립항보다는 선택적 종속항 또는 확장 실시예로 두는 것이 안전합니다.</w:t>
+      </w:r>
+    </w:p>
+    <w:p>
       <w:r>
         <w:br w:type="page"/>
       </w:r>
@@ -9890,7 +10596,7 @@
           <w:color w:val="1F2933"/>
           <w:sz w:val="21"/>
         </w:rPr>
-        <w:t>비품약 D를 신규 보관실 R에 기준수량 3으로 배정하면 시스템은 R-D-3 배치관계를 생성하고, 전체 약품목록에는 D의 등록상태를 유지하면서 R의 약품목록에 D를 즉시 표시합니다. 이어서 D의 라벨 마스터를 조회해 R의 라벨 대상과 출력 초안을 생성합니다. 마약류 E를 R에 배정한 경우에는 동일 처리에 더하여 R-E를 기준으로 LOT 입력키와 마약류 점검대상을 생성합니다. 이 과정은 한 번의 저장과 하나의 버전으로 처리되므로 별도의 전체목록, 실별목록, 라벨 및 마약류 Excel 파일을 각각 수정하지 않습니다.</w:t>
+        <w:t>비품약 D를 신규 보유 실 R에 기준수량 3으로 배정하면 시스템은 R-D-3 배치관계를 생성하고, 전체 약품목록에는 D의 등록상태를 유지하면서 R의 약품목록에 D를 즉시 표시합니다. 이어서 D의 라벨 마스터를 조회해 R의 라벨 대상과 출력 초안을 생성합니다. 마약류 E를 R에 배정한 경우에는 동일 처리에 더하여 R-E를 기준으로 LOT 입력키와 마약류 점검대상을 생성합니다. 이 과정은 한 번의 저장과 하나의 버전으로 처리되므로 별도의 전체목록, 실별목록, 라벨 및 마약류 Excel 파일을 각각 수정하지 않습니다.</w:t>
       </w:r>
     </w:p>
     <w:p>
@@ -9937,6 +10643,98 @@
           <w:sz w:val="21"/>
         </w:rPr>
         <w:t>점검자가 부서목록에서 병동 R2가 환자 검사로 즉시 점검하기 어려운 것을 확인하고 해당 버튼을 더블 터치하면, 시스템은 R2를 점검유예로 저장하고 버튼색을 반전합니다. 이후 R2의 체크리스트를 열면 모든 항목이 적합으로 초기화됩니다. 점검자는 보관상태 항목만 개선 필요로 전환하고 ‘냉장고 온도기록 보완’이라고 입력하며, 의약품 G의 유효기간을 입력합니다. G의 유효기간이 기준일로부터 3개월 미만이면 시스템은 유효기간 임박 예외를 추가합니다. 저장 시 R2의 유예표시는 해제되고 점검완료 상태로 바뀌며, 보관상태 개선사항과 G의 유효기간 임박정보가 순회점검 결과표와 PDF 보고서에 자동 삽입됩니다.</w:t>
+      </w:r>
+    </w:p>
+    <w:p>
+      <w:pPr>
+        <w:pStyle w:val="Heading2"/>
+      </w:pPr>
+      <w:r>
+        <w:t>9.8 점검 대상 실 확인과 마약류 LOT 대조 실시예</w:t>
+      </w:r>
+    </w:p>
+    <w:p>
+      <w:pPr>
+        <w:keepLines w:val="0"/>
+      </w:pPr>
+      <w:r>
+        <w:rPr>
+          <w:rFonts w:ascii="Malgun Gothic" w:hAnsi="Malgun Gothic" w:eastAsia="Malgun Gothic"/>
+          <w:b w:val="0"/>
+          <w:i w:val="0"/>
+          <w:color w:val="1F2933"/>
+          <w:sz w:val="21"/>
+        </w:rPr>
+        <w:t>점검자는 마약류 LOT 화면에 들어가기 전에 전체 대상 실 버튼에서 점검완료·미점검·점검유예 상태와 누락 부서를 확인합니다. 연계 프로그램에서 내려받은 LOT 파일을 가져오면 시스템은 실별 예상 LOT·수량·유효기간을 갱신합니다. 실 R3의 실제 LOT를 확인해 저장하면 누락·추가 LOT, 수량 차이 및 유효기간 예외가 결과표에 자동 삽입되고, R3의 부서상태와 LOT 점검상태가 같은 점검 식별자로 완료됩니다.</w:t>
+      </w:r>
+    </w:p>
+    <w:p>
+      <w:pPr>
+        <w:pStyle w:val="Heading2"/>
+      </w:pPr>
+      <w:r>
+        <w:t>9.9 보관장소 고유기호와 위치별 목록 실시예</w:t>
+      </w:r>
+    </w:p>
+    <w:p>
+      <w:pPr>
+        <w:keepLines w:val="0"/>
+      </w:pPr>
+      <w:r>
+        <w:rPr>
+          <w:rFonts w:ascii="Malgun Gothic" w:hAnsi="Malgun Gothic" w:eastAsia="Malgun Gothic"/>
+          <w:b w:val="0"/>
+          <w:i w:val="0"/>
+          <w:color w:val="1F2933"/>
+          <w:sz w:val="21"/>
+        </w:rPr>
+        <w:t>의약품 H의 보관장소 고유기호가 C-02-S3이면 시스템은 이를 보유 실이 아니라 약품장 C-02의 선반 S3 위치로 해석합니다. H의 라벨에 C-02-S3을 표시하고, C-02-S3 위치별 약품장 목록에 H를 자동 포함합니다. 위치관계가 바뀌면 라벨·목록·검색색인을 같은 버전으로 갱신합니다.</w:t>
+      </w:r>
+    </w:p>
+    <w:p>
+      <w:pPr>
+        <w:pStyle w:val="Heading2"/>
+      </w:pPr>
+      <w:r>
+        <w:t>9.10 라벨 최종본 저장·검색 실시예</w:t>
+      </w:r>
+    </w:p>
+    <w:p>
+      <w:pPr>
+        <w:keepLines w:val="0"/>
+      </w:pPr>
+      <w:r>
+        <w:rPr>
+          <w:rFonts w:ascii="Malgun Gothic" w:hAnsi="Malgun Gothic" w:eastAsia="Malgun Gothic"/>
+          <w:b w:val="0"/>
+          <w:i w:val="0"/>
+          <w:color w:val="1F2933"/>
+          <w:sz w:val="21"/>
+        </w:rPr>
+        <w:t>사용자가 H의 라벨 배치를 수정해 최종본으로 저장하면 다음 검색에서 해당 버전을 우선 표시합니다. 이후 약품명이나 제조사가 바뀌면 사용자가 조정한 자유편집영역은 유지하면서 마스터 종속필드만 최신 값으로 재주입하여, 검색 가능한 최신 최종본을 제공합니다.</w:t>
+      </w:r>
+    </w:p>
+    <w:p>
+      <w:pPr>
+        <w:pStyle w:val="Heading2"/>
+      </w:pPr>
+      <w:r>
+        <w:t>9.11 카메라 위치검색 확장 실시예</w:t>
+      </w:r>
+    </w:p>
+    <w:p>
+      <w:pPr>
+        <w:keepLines w:val="0"/>
+      </w:pPr>
+      <w:r>
+        <w:rPr>
+          <w:rFonts w:ascii="Malgun Gothic" w:hAnsi="Malgun Gothic" w:eastAsia="Malgun Gothic"/>
+          <w:b w:val="0"/>
+          <w:i w:val="0"/>
+          <w:color w:val="1F2933"/>
+          <w:sz w:val="21"/>
+        </w:rPr>
+        <w:t>모바일 카메라가 H의 라벨 문자를 인식하면 명칭·규격 후보를 마스터와 비교하고, 신뢰도가 낮을 때에는 사용자에게 후보를 선택하게 합니다. 확정된 H의 약품코드로 C-02-S3 위치관계를 조회하여 약품장·선반·구획을 표시합니다.</w:t>
       </w:r>
     </w:p>
     <w:p>
@@ -10795,6 +11593,250 @@
                 <w:color w:val="1F2933"/>
                 <w:sz w:val="17"/>
               </w:rPr>
+              <w:t>LOT 실재고 검증</w:t>
+            </w:r>
+          </w:p>
+        </w:tc>
+        <w:tc>
+          <w:tcPr>
+            <w:tcW w:type="dxa" w:w="7761"/>
+            <w:vAlign w:val="center"/>
+            <w:tcMar>
+              <w:top w:w="90" w:type="dxa"/>
+              <w:left w:w="120" w:type="dxa"/>
+              <w:bottom w:w="90" w:type="dxa"/>
+              <w:right w:w="120" w:type="dxa"/>
+            </w:tcMar>
+          </w:tcPr>
+          <w:p>
+            <w:pPr>
+              <w:spacing w:before="0" w:after="0" w:line="269" w:lineRule="auto"/>
+              <w:jc w:val="left"/>
+            </w:pPr>
+            <w:r/>
+            <w:r>
+              <w:rPr>
+                <w:rFonts w:ascii="Malgun Gothic" w:hAnsi="Malgun Gothic" w:eastAsia="Malgun Gothic"/>
+                <w:b w:val="0"/>
+                <w:i w:val="0"/>
+                <w:color w:val="1F2933"/>
+                <w:sz w:val="17"/>
+              </w:rPr>
+              <w:t>점검 누락 실을 먼저 식별하고 연계 프로그램의 예상 LOT와 실제 LOT·수량·유효기간 차이를 구조화함</w:t>
+            </w:r>
+          </w:p>
+        </w:tc>
+      </w:tr>
+      <w:tr>
+        <w:tc>
+          <w:tcPr>
+            <w:tcW w:type="dxa" w:w="1944"/>
+            <w:shd w:fill="F7F9FA"/>
+            <w:vAlign w:val="center"/>
+            <w:tcMar>
+              <w:top w:w="90" w:type="dxa"/>
+              <w:left w:w="120" w:type="dxa"/>
+              <w:bottom w:w="90" w:type="dxa"/>
+              <w:right w:w="120" w:type="dxa"/>
+            </w:tcMar>
+          </w:tcPr>
+          <w:p>
+            <w:pPr>
+              <w:spacing w:before="0" w:after="0" w:line="269" w:lineRule="auto"/>
+              <w:jc w:val="center"/>
+            </w:pPr>
+            <w:r/>
+            <w:r>
+              <w:rPr>
+                <w:rFonts w:ascii="Malgun Gothic" w:hAnsi="Malgun Gothic" w:eastAsia="Malgun Gothic"/>
+                <w:b w:val="0"/>
+                <w:i w:val="0"/>
+                <w:color w:val="1F2933"/>
+                <w:sz w:val="17"/>
+              </w:rPr>
+              <w:t>위치정보 재사용</w:t>
+            </w:r>
+          </w:p>
+        </w:tc>
+        <w:tc>
+          <w:tcPr>
+            <w:tcW w:type="dxa" w:w="7761"/>
+            <w:shd w:fill="F7F9FA"/>
+            <w:vAlign w:val="center"/>
+            <w:tcMar>
+              <w:top w:w="90" w:type="dxa"/>
+              <w:left w:w="120" w:type="dxa"/>
+              <w:bottom w:w="90" w:type="dxa"/>
+              <w:right w:w="120" w:type="dxa"/>
+            </w:tcMar>
+          </w:tcPr>
+          <w:p>
+            <w:pPr>
+              <w:spacing w:before="0" w:after="0" w:line="269" w:lineRule="auto"/>
+              <w:jc w:val="left"/>
+            </w:pPr>
+            <w:r/>
+            <w:r>
+              <w:rPr>
+                <w:rFonts w:ascii="Malgun Gothic" w:hAnsi="Malgun Gothic" w:eastAsia="Malgun Gothic"/>
+                <w:b w:val="0"/>
+                <w:i w:val="0"/>
+                <w:color w:val="1F2933"/>
+                <w:sz w:val="17"/>
+              </w:rPr>
+              <w:t>보유 실과 구별되는 보관장소 고유기호에서 위치표시 라벨·위치별 목록·양방향 검색을 함께 생성함</w:t>
+            </w:r>
+          </w:p>
+        </w:tc>
+      </w:tr>
+      <w:tr>
+        <w:tc>
+          <w:tcPr>
+            <w:tcW w:type="dxa" w:w="1944"/>
+            <w:vAlign w:val="center"/>
+            <w:tcMar>
+              <w:top w:w="90" w:type="dxa"/>
+              <w:left w:w="120" w:type="dxa"/>
+              <w:bottom w:w="90" w:type="dxa"/>
+              <w:right w:w="120" w:type="dxa"/>
+            </w:tcMar>
+          </w:tcPr>
+          <w:p>
+            <w:pPr>
+              <w:spacing w:before="0" w:after="0" w:line="269" w:lineRule="auto"/>
+              <w:jc w:val="center"/>
+            </w:pPr>
+            <w:r/>
+            <w:r>
+              <w:rPr>
+                <w:rFonts w:ascii="Malgun Gothic" w:hAnsi="Malgun Gothic" w:eastAsia="Malgun Gothic"/>
+                <w:b w:val="0"/>
+                <w:i w:val="0"/>
+                <w:color w:val="1F2933"/>
+                <w:sz w:val="17"/>
+              </w:rPr>
+              <w:t>라벨 검색·버전관리</w:t>
+            </w:r>
+          </w:p>
+        </w:tc>
+        <w:tc>
+          <w:tcPr>
+            <w:tcW w:type="dxa" w:w="7761"/>
+            <w:vAlign w:val="center"/>
+            <w:tcMar>
+              <w:top w:w="90" w:type="dxa"/>
+              <w:left w:w="120" w:type="dxa"/>
+              <w:bottom w:w="90" w:type="dxa"/>
+              <w:right w:w="120" w:type="dxa"/>
+            </w:tcMar>
+          </w:tcPr>
+          <w:p>
+            <w:pPr>
+              <w:spacing w:before="0" w:after="0" w:line="269" w:lineRule="auto"/>
+              <w:jc w:val="left"/>
+            </w:pPr>
+            <w:r/>
+            <w:r>
+              <w:rPr>
+                <w:rFonts w:ascii="Malgun Gothic" w:hAnsi="Malgun Gothic" w:eastAsia="Malgun Gothic"/>
+                <w:b w:val="0"/>
+                <w:i w:val="0"/>
+                <w:color w:val="1F2933"/>
+                <w:sz w:val="17"/>
+              </w:rPr>
+              <w:t>최신 최종본을 약품코드로 검색하고 수동 편집영역 보존과 최신 마스터 필드 재주입을 결합함</w:t>
+            </w:r>
+          </w:p>
+        </w:tc>
+      </w:tr>
+      <w:tr>
+        <w:tc>
+          <w:tcPr>
+            <w:tcW w:type="dxa" w:w="1944"/>
+            <w:shd w:fill="F7F9FA"/>
+            <w:vAlign w:val="center"/>
+            <w:tcMar>
+              <w:top w:w="90" w:type="dxa"/>
+              <w:left w:w="120" w:type="dxa"/>
+              <w:bottom w:w="90" w:type="dxa"/>
+              <w:right w:w="120" w:type="dxa"/>
+            </w:tcMar>
+          </w:tcPr>
+          <w:p>
+            <w:pPr>
+              <w:spacing w:before="0" w:after="0" w:line="269" w:lineRule="auto"/>
+              <w:jc w:val="center"/>
+            </w:pPr>
+            <w:r/>
+            <w:r>
+              <w:rPr>
+                <w:rFonts w:ascii="Malgun Gothic" w:hAnsi="Malgun Gothic" w:eastAsia="Malgun Gothic"/>
+                <w:b w:val="0"/>
+                <w:i w:val="0"/>
+                <w:color w:val="1F2933"/>
+                <w:sz w:val="17"/>
+              </w:rPr>
+              <w:t>배포·복구 일관성</w:t>
+            </w:r>
+          </w:p>
+        </w:tc>
+        <w:tc>
+          <w:tcPr>
+            <w:tcW w:type="dxa" w:w="7761"/>
+            <w:shd w:fill="F7F9FA"/>
+            <w:vAlign w:val="center"/>
+            <w:tcMar>
+              <w:top w:w="90" w:type="dxa"/>
+              <w:left w:w="120" w:type="dxa"/>
+              <w:bottom w:w="90" w:type="dxa"/>
+              <w:right w:w="120" w:type="dxa"/>
+            </w:tcMar>
+          </w:tcPr>
+          <w:p>
+            <w:pPr>
+              <w:spacing w:before="0" w:after="0" w:line="269" w:lineRule="auto"/>
+              <w:jc w:val="left"/>
+            </w:pPr>
+            <w:r/>
+            <w:r>
+              <w:rPr>
+                <w:rFonts w:ascii="Malgun Gothic" w:hAnsi="Malgun Gothic" w:eastAsia="Malgun Gothic"/>
+                <w:b w:val="0"/>
+                <w:i w:val="0"/>
+                <w:color w:val="1F2933"/>
+                <w:sz w:val="17"/>
+              </w:rPr>
+              <w:t>앱 빌드와 업무 데이터 버전을 분리하고 역할별 동기화·이중 백업·호환 버전 롤백을 적용함</w:t>
+            </w:r>
+          </w:p>
+        </w:tc>
+      </w:tr>
+      <w:tr>
+        <w:tc>
+          <w:tcPr>
+            <w:tcW w:type="dxa" w:w="1944"/>
+            <w:vAlign w:val="center"/>
+            <w:tcMar>
+              <w:top w:w="90" w:type="dxa"/>
+              <w:left w:w="120" w:type="dxa"/>
+              <w:bottom w:w="90" w:type="dxa"/>
+              <w:right w:w="120" w:type="dxa"/>
+            </w:tcMar>
+          </w:tcPr>
+          <w:p>
+            <w:pPr>
+              <w:spacing w:before="0" w:after="0" w:line="269" w:lineRule="auto"/>
+              <w:jc w:val="center"/>
+            </w:pPr>
+            <w:r/>
+            <w:r>
+              <w:rPr>
+                <w:rFonts w:ascii="Malgun Gothic" w:hAnsi="Malgun Gothic" w:eastAsia="Malgun Gothic"/>
+                <w:b w:val="0"/>
+                <w:i w:val="0"/>
+                <w:color w:val="1F2933"/>
+                <w:sz w:val="17"/>
+              </w:rPr>
               <w:t>출력 효율</w:t>
             </w:r>
           </w:p>
@@ -11016,6 +12058,81 @@
           <w:sz w:val="20"/>
         </w:rPr>
         <w:t>체크리스트를 적합으로 초기화한 뒤 개선필요 항목과 3개월 미만 유효기간 예외만 구조화하여 결과표·보고서를 자동완성하는 방식</w:t>
+      </w:r>
+    </w:p>
+    <w:p>
+      <w:pPr>
+        <w:pStyle w:val="ListBullet"/>
+      </w:pPr>
+      <w:r>
+        <w:rPr>
+          <w:rFonts w:ascii="Malgun Gothic" w:hAnsi="Malgun Gothic" w:eastAsia="Malgun Gothic"/>
+          <w:b w:val="0"/>
+          <w:i w:val="0"/>
+          <w:color w:val="1F2933"/>
+          <w:sz w:val="20"/>
+        </w:rPr>
+        <w:t>점검완료·미점검·점검유예 버튼으로 누락 실을 먼저 확정한 후 내려받은 예상 LOT와 현장 실재고 LOT·수량·유효기간을 대조하여 예외와 감사이력을 생성하는 방식</w:t>
+      </w:r>
+    </w:p>
+    <w:p>
+      <w:pPr>
+        <w:pStyle w:val="ListBullet"/>
+      </w:pPr>
+      <w:r>
+        <w:rPr>
+          <w:rFonts w:ascii="Malgun Gothic" w:hAnsi="Malgun Gothic" w:eastAsia="Malgun Gothic"/>
+          <w:b w:val="0"/>
+          <w:i w:val="0"/>
+          <w:color w:val="1F2933"/>
+          <w:sz w:val="20"/>
+        </w:rPr>
+        <w:t>보유 실과 구별되는 약품장·선반·구획의 보관장소 고유기호를 약품코드와 연결하여 위치표시 라벨, 위치별 약품장 목록 및 양방향 검색을 공동 생성하는 방식</w:t>
+      </w:r>
+    </w:p>
+    <w:p>
+      <w:pPr>
+        <w:pStyle w:val="ListBullet"/>
+      </w:pPr>
+      <w:r>
+        <w:rPr>
+          <w:rFonts w:ascii="Malgun Gothic" w:hAnsi="Malgun Gothic" w:eastAsia="Malgun Gothic"/>
+          <w:b w:val="0"/>
+          <w:i w:val="0"/>
+          <w:color w:val="1F2933"/>
+          <w:sz w:val="20"/>
+        </w:rPr>
+        <w:t>라벨 최종본을 버전 객체로 보존하고 검색 시 최신 유효 최종본의 자유편집영역과 최신 마스터 종속필드를 결합하는 방식</w:t>
+      </w:r>
+    </w:p>
+    <w:p>
+      <w:pPr>
+        <w:pStyle w:val="ListBullet"/>
+      </w:pPr>
+      <w:r>
+        <w:rPr>
+          <w:rFonts w:ascii="Malgun Gothic" w:hAnsi="Malgun Gothic" w:eastAsia="Malgun Gothic"/>
+          <w:b w:val="0"/>
+          <w:i w:val="0"/>
+          <w:color w:val="1F2933"/>
+          <w:sz w:val="20"/>
+        </w:rPr>
+        <w:t>앱 빌드 버전과 업무 데이터 버전을 분리하여 역할별 PC·모바일에 갱신을 전달하고 이중 백업에서 호환 버전으로 복구하는 방식</w:t>
+      </w:r>
+    </w:p>
+    <w:p>
+      <w:pPr>
+        <w:pStyle w:val="ListBullet"/>
+      </w:pPr>
+      <w:r>
+        <w:rPr>
+          <w:rFonts w:ascii="Malgun Gothic" w:hAnsi="Malgun Gothic" w:eastAsia="Malgun Gothic"/>
+          <w:b w:val="0"/>
+          <w:i w:val="0"/>
+          <w:color w:val="1F2933"/>
+          <w:sz w:val="20"/>
+        </w:rPr>
+        <w:t>카메라 라벨인식 결과를 마스터와 신뢰도 기반 매칭한 후 기존 보관장소 고유기호 관계로 약품장·선반·구획을 표시하는 확장 방식</w:t>
       </w:r>
     </w:p>
     <w:tbl>
@@ -11330,6 +12447,51 @@
           <w:color w:val="1F2933"/>
           <w:sz w:val="20"/>
         </w:rPr>
+        <w:t>점검 대상 실의 미점검·점검유예 상태와 누락 부서를 식별한 후 마약류 연계 프로그램의 예상 LOT와 현장 실제 LOT·수량·유효기간을 대조하여 예외를 생성하는 LOT 동기화·대조부(1910~1950);</w:t>
+      </w:r>
+    </w:p>
+    <w:p>
+      <w:pPr>
+        <w:pStyle w:val="ListBullet"/>
+      </w:pPr>
+      <w:r>
+        <w:rPr>
+          <w:rFonts w:ascii="Malgun Gothic" w:hAnsi="Malgun Gothic" w:eastAsia="Malgun Gothic"/>
+          <w:b w:val="0"/>
+          <w:i w:val="0"/>
+          <w:color w:val="1F2933"/>
+          <w:sz w:val="20"/>
+        </w:rPr>
+        <w:t>보유 실과 구별되는 보관장소 고유기호를 의약품 식별코드와 연결하여 위치표시 라벨, 위치별 약품장 목록 및 의약품-위치 양방향 검색을 생성하는 위치관계 처리부(2010~2050);</w:t>
+      </w:r>
+    </w:p>
+    <w:p>
+      <w:pPr>
+        <w:pStyle w:val="ListBullet"/>
+      </w:pPr>
+      <w:r>
+        <w:rPr>
+          <w:rFonts w:ascii="Malgun Gothic" w:hAnsi="Malgun Gothic" w:eastAsia="Malgun Gothic"/>
+          <w:b w:val="0"/>
+          <w:i w:val="0"/>
+          <w:color w:val="1F2933"/>
+          <w:sz w:val="20"/>
+        </w:rPr>
+        <w:t>라벨 최종본을 버전 레코드로 보존하고 검색 시 최신 유효 최종본에 최신 마스터 종속필드를 재주입하는 라벨 최종본 관리부(2110~2130);</w:t>
+      </w:r>
+    </w:p>
+    <w:p>
+      <w:pPr>
+        <w:pStyle w:val="ListBullet"/>
+      </w:pPr>
+      <w:r>
+        <w:rPr>
+          <w:rFonts w:ascii="Malgun Gothic" w:hAnsi="Malgun Gothic" w:eastAsia="Malgun Gothic"/>
+          <w:b w:val="0"/>
+          <w:i w:val="0"/>
+          <w:color w:val="1F2933"/>
+          <w:sz w:val="20"/>
+        </w:rPr>
         <w:t>저장된 수동 편집본, 매칭된 원본 라벨 및 신규 초안 중 하나를 선택하여 출력 라벨을 생성하는 라벨 처리부(152); 및</w:t>
       </w:r>
     </w:p>
@@ -11593,6 +12755,51 @@
           <w:color w:val="1F2933"/>
           <w:sz w:val="20"/>
         </w:rPr>
+        <w:t>점검완료·미점검·점검유예 상태와 누락 실을 확인한 후 내려받은 마약류 예상 LOT와 현장 실제 LOT·수량·유효기간을 대조하여 예외를 생성하는 단계;</w:t>
+      </w:r>
+    </w:p>
+    <w:p>
+      <w:pPr>
+        <w:pStyle w:val="ListNumber"/>
+      </w:pPr>
+      <w:r>
+        <w:rPr>
+          <w:rFonts w:ascii="Malgun Gothic" w:hAnsi="Malgun Gothic" w:eastAsia="Malgun Gothic"/>
+          <w:b w:val="0"/>
+          <w:i w:val="0"/>
+          <w:color w:val="1F2933"/>
+          <w:sz w:val="20"/>
+        </w:rPr>
+        <w:t>보유 실과 구별되는 보관장소 고유기호를 의약품 식별코드와 연결하여 위치표시 라벨과 위치별 약품장 목록을 생성하는 단계;</w:t>
+      </w:r>
+    </w:p>
+    <w:p>
+      <w:pPr>
+        <w:pStyle w:val="ListNumber"/>
+      </w:pPr>
+      <w:r>
+        <w:rPr>
+          <w:rFonts w:ascii="Malgun Gothic" w:hAnsi="Malgun Gothic" w:eastAsia="Malgun Gothic"/>
+          <w:b w:val="0"/>
+          <w:i w:val="0"/>
+          <w:color w:val="1F2933"/>
+          <w:sz w:val="20"/>
+        </w:rPr>
+        <w:t>라벨 최종본을 버전 객체로 저장하고 검색 시 최신 최종본의 자유편집영역을 유지하면서 최신 마스터 종속필드를 재주입하는 단계;</w:t>
+      </w:r>
+    </w:p>
+    <w:p>
+      <w:pPr>
+        <w:pStyle w:val="ListNumber"/>
+      </w:pPr>
+      <w:r>
+        <w:rPr>
+          <w:rFonts w:ascii="Malgun Gothic" w:hAnsi="Malgun Gothic" w:eastAsia="Malgun Gothic"/>
+          <w:b w:val="0"/>
+          <w:i w:val="0"/>
+          <w:color w:val="1F2933"/>
+          <w:sz w:val="20"/>
+        </w:rPr>
         <w:t>선택된 방의 배치 레코드와 의약품 마스터를 조인하여 점검목록을 생성하는 단계;</w:t>
       </w:r>
     </w:p>
@@ -11932,6 +13139,81 @@
           <w:sz w:val="20"/>
         </w:rPr>
         <w:t>체크리스트 적합 기본값에서 개선필요 항목만 입력받고 3개월 미만 유효기간을 자동 판정하여 결과표·보고서에 자동삽입하는 구성</w:t>
+      </w:r>
+    </w:p>
+    <w:p>
+      <w:pPr>
+        <w:pStyle w:val="ListBullet"/>
+      </w:pPr>
+      <w:r>
+        <w:rPr>
+          <w:rFonts w:ascii="Malgun Gothic" w:hAnsi="Malgun Gothic" w:eastAsia="Malgun Gothic"/>
+          <w:b w:val="0"/>
+          <w:i w:val="0"/>
+          <w:color w:val="1F2933"/>
+          <w:sz w:val="20"/>
+        </w:rPr>
+        <w:t>마약류 연계 프로그램에서 내려받은 실별 LOT 원본의 기준시점을 검증하고 실제 보유 LOT와의 누락·추가·수량·유효기간 차이를 산출하는 구성</w:t>
+      </w:r>
+    </w:p>
+    <w:p>
+      <w:pPr>
+        <w:pStyle w:val="ListBullet"/>
+      </w:pPr>
+      <w:r>
+        <w:rPr>
+          <w:rFonts w:ascii="Malgun Gothic" w:hAnsi="Malgun Gothic" w:eastAsia="Malgun Gothic"/>
+          <w:b w:val="0"/>
+          <w:i w:val="0"/>
+          <w:color w:val="1F2933"/>
+          <w:sz w:val="20"/>
+        </w:rPr>
+        <w:t>보관장소 고유기호가 약품장·선반·구획을 특정하고 위치표시 라벨·위치별 목록·양방향 검색을 함께 생성하는 구성</w:t>
+      </w:r>
+    </w:p>
+    <w:p>
+      <w:pPr>
+        <w:pStyle w:val="ListBullet"/>
+      </w:pPr>
+      <w:r>
+        <w:rPr>
+          <w:rFonts w:ascii="Malgun Gothic" w:hAnsi="Malgun Gothic" w:eastAsia="Malgun Gothic"/>
+          <w:b w:val="0"/>
+          <w:i w:val="0"/>
+          <w:color w:val="1F2933"/>
+          <w:sz w:val="20"/>
+        </w:rPr>
+        <w:t>labelId·약품코드·보관장소 고유기호·저장시각·마스터버전을 포함하는 라벨 최종본 레코드를 저장하고 최신 마스터 필드를 재주입하는 구성</w:t>
+      </w:r>
+    </w:p>
+    <w:p>
+      <w:pPr>
+        <w:pStyle w:val="ListBullet"/>
+      </w:pPr>
+      <w:r>
+        <w:rPr>
+          <w:rFonts w:ascii="Malgun Gothic" w:hAnsi="Malgun Gothic" w:eastAsia="Malgun Gothic"/>
+          <w:b w:val="0"/>
+          <w:i w:val="0"/>
+          <w:color w:val="1F2933"/>
+          <w:sz w:val="20"/>
+        </w:rPr>
+        <w:t>애플리케이션 버전과 업무 데이터 버전을 분리하여 역할별 뷰어에 전달하고 이중 백업에서 호환 버전으로 롤백하는 구성</w:t>
+      </w:r>
+    </w:p>
+    <w:p>
+      <w:pPr>
+        <w:pStyle w:val="ListBullet"/>
+      </w:pPr>
+      <w:r>
+        <w:rPr>
+          <w:rFonts w:ascii="Malgun Gothic" w:hAnsi="Malgun Gothic" w:eastAsia="Malgun Gothic"/>
+          <w:b w:val="0"/>
+          <w:i w:val="0"/>
+          <w:color w:val="1F2933"/>
+          <w:sz w:val="20"/>
+        </w:rPr>
+        <w:t>카메라 인식문자열의 신뢰도 또는 후보목록으로 약품코드를 확정한 후 기존 위치관계에서 보관장소 고유기호를 출력하는 구성</w:t>
       </w:r>
     </w:p>
     <w:p>
@@ -13126,6 +14408,310 @@
                 <w:sz w:val="17"/>
               </w:rPr>
               <w:t>적합 기본값, 개선필요 입력, 3개월 미만 유효기간 판정 및 결과표·보고서 자동완성 흐름도</w:t>
+            </w:r>
+          </w:p>
+        </w:tc>
+      </w:tr>
+      <w:tr>
+        <w:tc>
+          <w:tcPr>
+            <w:tcW w:type="dxa" w:w="1296"/>
+            <w:vAlign w:val="center"/>
+            <w:tcMar>
+              <w:top w:w="90" w:type="dxa"/>
+              <w:left w:w="120" w:type="dxa"/>
+              <w:bottom w:w="90" w:type="dxa"/>
+              <w:right w:w="120" w:type="dxa"/>
+            </w:tcMar>
+          </w:tcPr>
+          <w:p>
+            <w:pPr>
+              <w:spacing w:before="0" w:after="0" w:line="269" w:lineRule="auto"/>
+              <w:jc w:val="center"/>
+            </w:pPr>
+            <w:r/>
+            <w:r>
+              <w:rPr>
+                <w:rFonts w:ascii="Malgun Gothic" w:hAnsi="Malgun Gothic" w:eastAsia="Malgun Gothic"/>
+                <w:b w:val="0"/>
+                <w:i w:val="0"/>
+                <w:color w:val="1F2933"/>
+                <w:sz w:val="17"/>
+              </w:rPr>
+              <w:t>도 19</w:t>
+            </w:r>
+          </w:p>
+        </w:tc>
+        <w:tc>
+          <w:tcPr>
+            <w:tcW w:type="dxa" w:w="8409"/>
+            <w:vAlign w:val="center"/>
+            <w:tcMar>
+              <w:top w:w="90" w:type="dxa"/>
+              <w:left w:w="120" w:type="dxa"/>
+              <w:bottom w:w="90" w:type="dxa"/>
+              <w:right w:w="120" w:type="dxa"/>
+            </w:tcMar>
+          </w:tcPr>
+          <w:p>
+            <w:pPr>
+              <w:spacing w:before="0" w:after="0" w:line="269" w:lineRule="auto"/>
+              <w:jc w:val="left"/>
+            </w:pPr>
+            <w:r/>
+            <w:r>
+              <w:rPr>
+                <w:rFonts w:ascii="Malgun Gothic" w:hAnsi="Malgun Gothic" w:eastAsia="Malgun Gothic"/>
+                <w:b w:val="0"/>
+                <w:i w:val="0"/>
+                <w:color w:val="1F2933"/>
+                <w:sz w:val="17"/>
+              </w:rPr>
+              <w:t>점검 대상 실 상태 확인 후 마약류 보유 LOT 원본을 동기화하고 현장 실재고와 대조하는 흐름도</w:t>
+            </w:r>
+          </w:p>
+        </w:tc>
+      </w:tr>
+      <w:tr>
+        <w:tc>
+          <w:tcPr>
+            <w:tcW w:type="dxa" w:w="1296"/>
+            <w:shd w:fill="F7F9FA"/>
+            <w:vAlign w:val="center"/>
+            <w:tcMar>
+              <w:top w:w="90" w:type="dxa"/>
+              <w:left w:w="120" w:type="dxa"/>
+              <w:bottom w:w="90" w:type="dxa"/>
+              <w:right w:w="120" w:type="dxa"/>
+            </w:tcMar>
+          </w:tcPr>
+          <w:p>
+            <w:pPr>
+              <w:spacing w:before="0" w:after="0" w:line="269" w:lineRule="auto"/>
+              <w:jc w:val="center"/>
+            </w:pPr>
+            <w:r/>
+            <w:r>
+              <w:rPr>
+                <w:rFonts w:ascii="Malgun Gothic" w:hAnsi="Malgun Gothic" w:eastAsia="Malgun Gothic"/>
+                <w:b w:val="0"/>
+                <w:i w:val="0"/>
+                <w:color w:val="1F2933"/>
+                <w:sz w:val="17"/>
+              </w:rPr>
+              <w:t>도 20</w:t>
+            </w:r>
+          </w:p>
+        </w:tc>
+        <w:tc>
+          <w:tcPr>
+            <w:tcW w:type="dxa" w:w="8409"/>
+            <w:shd w:fill="F7F9FA"/>
+            <w:vAlign w:val="center"/>
+            <w:tcMar>
+              <w:top w:w="90" w:type="dxa"/>
+              <w:left w:w="120" w:type="dxa"/>
+              <w:bottom w:w="90" w:type="dxa"/>
+              <w:right w:w="120" w:type="dxa"/>
+            </w:tcMar>
+          </w:tcPr>
+          <w:p>
+            <w:pPr>
+              <w:spacing w:before="0" w:after="0" w:line="269" w:lineRule="auto"/>
+              <w:jc w:val="left"/>
+            </w:pPr>
+            <w:r/>
+            <w:r>
+              <w:rPr>
+                <w:rFonts w:ascii="Malgun Gothic" w:hAnsi="Malgun Gothic" w:eastAsia="Malgun Gothic"/>
+                <w:b w:val="0"/>
+                <w:i w:val="0"/>
+                <w:color w:val="1F2933"/>
+                <w:sz w:val="17"/>
+              </w:rPr>
+              <w:t>보관장소 고유기호에서 위치표시 라벨·위치별 약품장 목록·양방향 검색을 생성하는 블록도</w:t>
+            </w:r>
+          </w:p>
+        </w:tc>
+      </w:tr>
+      <w:tr>
+        <w:tc>
+          <w:tcPr>
+            <w:tcW w:type="dxa" w:w="1296"/>
+            <w:vAlign w:val="center"/>
+            <w:tcMar>
+              <w:top w:w="90" w:type="dxa"/>
+              <w:left w:w="120" w:type="dxa"/>
+              <w:bottom w:w="90" w:type="dxa"/>
+              <w:right w:w="120" w:type="dxa"/>
+            </w:tcMar>
+          </w:tcPr>
+          <w:p>
+            <w:pPr>
+              <w:spacing w:before="0" w:after="0" w:line="269" w:lineRule="auto"/>
+              <w:jc w:val="center"/>
+            </w:pPr>
+            <w:r/>
+            <w:r>
+              <w:rPr>
+                <w:rFonts w:ascii="Malgun Gothic" w:hAnsi="Malgun Gothic" w:eastAsia="Malgun Gothic"/>
+                <w:b w:val="0"/>
+                <w:i w:val="0"/>
+                <w:color w:val="1F2933"/>
+                <w:sz w:val="17"/>
+              </w:rPr>
+              <w:t>도 21</w:t>
+            </w:r>
+          </w:p>
+        </w:tc>
+        <w:tc>
+          <w:tcPr>
+            <w:tcW w:type="dxa" w:w="8409"/>
+            <w:vAlign w:val="center"/>
+            <w:tcMar>
+              <w:top w:w="90" w:type="dxa"/>
+              <w:left w:w="120" w:type="dxa"/>
+              <w:bottom w:w="90" w:type="dxa"/>
+              <w:right w:w="120" w:type="dxa"/>
+            </w:tcMar>
+          </w:tcPr>
+          <w:p>
+            <w:pPr>
+              <w:spacing w:before="0" w:after="0" w:line="269" w:lineRule="auto"/>
+              <w:jc w:val="left"/>
+            </w:pPr>
+            <w:r/>
+            <w:r>
+              <w:rPr>
+                <w:rFonts w:ascii="Malgun Gothic" w:hAnsi="Malgun Gothic" w:eastAsia="Malgun Gothic"/>
+                <w:b w:val="0"/>
+                <w:i w:val="0"/>
+                <w:color w:val="1F2933"/>
+                <w:sz w:val="17"/>
+              </w:rPr>
+              <w:t>라벨 최종본 저장, 최신 마스터 정보 재주입 및 약품코드 검색 흐름도</w:t>
+            </w:r>
+          </w:p>
+        </w:tc>
+      </w:tr>
+      <w:tr>
+        <w:tc>
+          <w:tcPr>
+            <w:tcW w:type="dxa" w:w="1296"/>
+            <w:shd w:fill="F7F9FA"/>
+            <w:vAlign w:val="center"/>
+            <w:tcMar>
+              <w:top w:w="90" w:type="dxa"/>
+              <w:left w:w="120" w:type="dxa"/>
+              <w:bottom w:w="90" w:type="dxa"/>
+              <w:right w:w="120" w:type="dxa"/>
+            </w:tcMar>
+          </w:tcPr>
+          <w:p>
+            <w:pPr>
+              <w:spacing w:before="0" w:after="0" w:line="269" w:lineRule="auto"/>
+              <w:jc w:val="center"/>
+            </w:pPr>
+            <w:r/>
+            <w:r>
+              <w:rPr>
+                <w:rFonts w:ascii="Malgun Gothic" w:hAnsi="Malgun Gothic" w:eastAsia="Malgun Gothic"/>
+                <w:b w:val="0"/>
+                <w:i w:val="0"/>
+                <w:color w:val="1F2933"/>
+                <w:sz w:val="17"/>
+              </w:rPr>
+              <w:t>도 22</w:t>
+            </w:r>
+          </w:p>
+        </w:tc>
+        <w:tc>
+          <w:tcPr>
+            <w:tcW w:type="dxa" w:w="8409"/>
+            <w:shd w:fill="F7F9FA"/>
+            <w:vAlign w:val="center"/>
+            <w:tcMar>
+              <w:top w:w="90" w:type="dxa"/>
+              <w:left w:w="120" w:type="dxa"/>
+              <w:bottom w:w="90" w:type="dxa"/>
+              <w:right w:w="120" w:type="dxa"/>
+            </w:tcMar>
+          </w:tcPr>
+          <w:p>
+            <w:pPr>
+              <w:spacing w:before="0" w:after="0" w:line="269" w:lineRule="auto"/>
+              <w:jc w:val="left"/>
+            </w:pPr>
+            <w:r/>
+            <w:r>
+              <w:rPr>
+                <w:rFonts w:ascii="Malgun Gothic" w:hAnsi="Malgun Gothic" w:eastAsia="Malgun Gothic"/>
+                <w:b w:val="0"/>
+                <w:i w:val="0"/>
+                <w:color w:val="1F2933"/>
+                <w:sz w:val="17"/>
+              </w:rPr>
+              <w:t>배포 저장소·공동 클라우드 서버·역할별 뷰어·이중 백업의 버전 동기화 블록도</w:t>
+            </w:r>
+          </w:p>
+        </w:tc>
+      </w:tr>
+      <w:tr>
+        <w:tc>
+          <w:tcPr>
+            <w:tcW w:type="dxa" w:w="1296"/>
+            <w:vAlign w:val="center"/>
+            <w:tcMar>
+              <w:top w:w="90" w:type="dxa"/>
+              <w:left w:w="120" w:type="dxa"/>
+              <w:bottom w:w="90" w:type="dxa"/>
+              <w:right w:w="120" w:type="dxa"/>
+            </w:tcMar>
+          </w:tcPr>
+          <w:p>
+            <w:pPr>
+              <w:spacing w:before="0" w:after="0" w:line="269" w:lineRule="auto"/>
+              <w:jc w:val="center"/>
+            </w:pPr>
+            <w:r/>
+            <w:r>
+              <w:rPr>
+                <w:rFonts w:ascii="Malgun Gothic" w:hAnsi="Malgun Gothic" w:eastAsia="Malgun Gothic"/>
+                <w:b w:val="0"/>
+                <w:i w:val="0"/>
+                <w:color w:val="1F2933"/>
+                <w:sz w:val="17"/>
+              </w:rPr>
+              <w:t>도 23</w:t>
+            </w:r>
+          </w:p>
+        </w:tc>
+        <w:tc>
+          <w:tcPr>
+            <w:tcW w:type="dxa" w:w="8409"/>
+            <w:vAlign w:val="center"/>
+            <w:tcMar>
+              <w:top w:w="90" w:type="dxa"/>
+              <w:left w:w="120" w:type="dxa"/>
+              <w:bottom w:w="90" w:type="dxa"/>
+              <w:right w:w="120" w:type="dxa"/>
+            </w:tcMar>
+          </w:tcPr>
+          <w:p>
+            <w:pPr>
+              <w:spacing w:before="0" w:after="0" w:line="269" w:lineRule="auto"/>
+              <w:jc w:val="left"/>
+            </w:pPr>
+            <w:r/>
+            <w:r>
+              <w:rPr>
+                <w:rFonts w:ascii="Malgun Gothic" w:hAnsi="Malgun Gothic" w:eastAsia="Malgun Gothic"/>
+                <w:b w:val="0"/>
+                <w:i w:val="0"/>
+                <w:color w:val="1F2933"/>
+                <w:sz w:val="17"/>
+              </w:rPr>
+              <w:t>카메라 라벨인식, 후보 매칭 및 보관장소 고유기호 출력의 확장 흐름도</w:t>
             </w:r>
           </w:p>
         </w:tc>
@@ -16399,6 +17985,594 @@
           </w:p>
         </w:tc>
       </w:tr>
+      <w:tr>
+        <w:tc>
+          <w:tcPr>
+            <w:tcW w:type="dxa" w:w="835"/>
+            <w:vAlign w:val="center"/>
+            <w:tcMar>
+              <w:top w:w="90" w:type="dxa"/>
+              <w:left w:w="120" w:type="dxa"/>
+              <w:bottom w:w="90" w:type="dxa"/>
+              <w:right w:w="120" w:type="dxa"/>
+            </w:tcMar>
+          </w:tcPr>
+          <w:p>
+            <w:pPr>
+              <w:spacing w:before="0" w:after="0" w:line="269" w:lineRule="auto"/>
+              <w:jc w:val="center"/>
+            </w:pPr>
+            <w:r/>
+            <w:r>
+              <w:rPr>
+                <w:rFonts w:ascii="Malgun Gothic" w:hAnsi="Malgun Gothic" w:eastAsia="Malgun Gothic"/>
+                <w:b w:val="0"/>
+                <w:i w:val="0"/>
+                <w:color w:val="1F2933"/>
+                <w:sz w:val="16"/>
+              </w:rPr>
+              <w:t>1901~1950</w:t>
+            </w:r>
+          </w:p>
+        </w:tc>
+        <w:tc>
+          <w:tcPr>
+            <w:tcW w:type="dxa" w:w="4017"/>
+            <w:vAlign w:val="center"/>
+            <w:tcMar>
+              <w:top w:w="90" w:type="dxa"/>
+              <w:left w:w="120" w:type="dxa"/>
+              <w:bottom w:w="90" w:type="dxa"/>
+              <w:right w:w="120" w:type="dxa"/>
+            </w:tcMar>
+          </w:tcPr>
+          <w:p>
+            <w:pPr>
+              <w:spacing w:before="0" w:after="0" w:line="269" w:lineRule="auto"/>
+              <w:jc w:val="left"/>
+            </w:pPr>
+            <w:r/>
+            <w:r>
+              <w:rPr>
+                <w:rFonts w:ascii="Malgun Gothic" w:hAnsi="Malgun Gothic" w:eastAsia="Malgun Gothic"/>
+                <w:b w:val="0"/>
+                <w:i w:val="0"/>
+                <w:color w:val="1F2933"/>
+                <w:sz w:val="16"/>
+              </w:rPr>
+              <w:t>점검 실 버튼·누락 실 확인 및 마약류 LOT 동기화·실재고 대조부</w:t>
+            </w:r>
+          </w:p>
+        </w:tc>
+        <w:tc>
+          <w:tcPr>
+            <w:tcW w:type="dxa" w:w="835"/>
+            <w:vAlign w:val="center"/>
+            <w:tcMar>
+              <w:top w:w="90" w:type="dxa"/>
+              <w:left w:w="120" w:type="dxa"/>
+              <w:bottom w:w="90" w:type="dxa"/>
+              <w:right w:w="120" w:type="dxa"/>
+            </w:tcMar>
+          </w:tcPr>
+          <w:p>
+            <w:pPr>
+              <w:spacing w:before="0" w:after="0" w:line="269" w:lineRule="auto"/>
+              <w:jc w:val="left"/>
+            </w:pPr>
+            <w:r/>
+            <w:r>
+              <w:rPr>
+                <w:rFonts w:ascii="Malgun Gothic" w:hAnsi="Malgun Gothic" w:eastAsia="Malgun Gothic"/>
+                <w:b w:val="0"/>
+                <w:i w:val="0"/>
+                <w:color w:val="1F2933"/>
+                <w:sz w:val="16"/>
+              </w:rPr>
+            </w:r>
+          </w:p>
+        </w:tc>
+        <w:tc>
+          <w:tcPr>
+            <w:tcW w:type="dxa" w:w="4017"/>
+            <w:vAlign w:val="center"/>
+            <w:tcMar>
+              <w:top w:w="90" w:type="dxa"/>
+              <w:left w:w="120" w:type="dxa"/>
+              <w:bottom w:w="90" w:type="dxa"/>
+              <w:right w:w="120" w:type="dxa"/>
+            </w:tcMar>
+          </w:tcPr>
+          <w:p>
+            <w:pPr>
+              <w:spacing w:before="0" w:after="0" w:line="269" w:lineRule="auto"/>
+              <w:jc w:val="left"/>
+            </w:pPr>
+            <w:r/>
+            <w:r>
+              <w:rPr>
+                <w:rFonts w:ascii="Malgun Gothic" w:hAnsi="Malgun Gothic" w:eastAsia="Malgun Gothic"/>
+                <w:b w:val="0"/>
+                <w:i w:val="0"/>
+                <w:color w:val="1F2933"/>
+                <w:sz w:val="16"/>
+              </w:rPr>
+            </w:r>
+          </w:p>
+        </w:tc>
+      </w:tr>
+      <w:tr>
+        <w:tc>
+          <w:tcPr>
+            <w:tcW w:type="dxa" w:w="835"/>
+            <w:shd w:fill="F7F9FA"/>
+            <w:vAlign w:val="center"/>
+            <w:tcMar>
+              <w:top w:w="90" w:type="dxa"/>
+              <w:left w:w="120" w:type="dxa"/>
+              <w:bottom w:w="90" w:type="dxa"/>
+              <w:right w:w="120" w:type="dxa"/>
+            </w:tcMar>
+          </w:tcPr>
+          <w:p>
+            <w:pPr>
+              <w:spacing w:before="0" w:after="0" w:line="269" w:lineRule="auto"/>
+              <w:jc w:val="center"/>
+            </w:pPr>
+            <w:r/>
+            <w:r>
+              <w:rPr>
+                <w:rFonts w:ascii="Malgun Gothic" w:hAnsi="Malgun Gothic" w:eastAsia="Malgun Gothic"/>
+                <w:b w:val="0"/>
+                <w:i w:val="0"/>
+                <w:color w:val="1F2933"/>
+                <w:sz w:val="16"/>
+              </w:rPr>
+              <w:t>2010~2050</w:t>
+            </w:r>
+          </w:p>
+        </w:tc>
+        <w:tc>
+          <w:tcPr>
+            <w:tcW w:type="dxa" w:w="4017"/>
+            <w:shd w:fill="F7F9FA"/>
+            <w:vAlign w:val="center"/>
+            <w:tcMar>
+              <w:top w:w="90" w:type="dxa"/>
+              <w:left w:w="120" w:type="dxa"/>
+              <w:bottom w:w="90" w:type="dxa"/>
+              <w:right w:w="120" w:type="dxa"/>
+            </w:tcMar>
+          </w:tcPr>
+          <w:p>
+            <w:pPr>
+              <w:spacing w:before="0" w:after="0" w:line="269" w:lineRule="auto"/>
+              <w:jc w:val="left"/>
+            </w:pPr>
+            <w:r/>
+            <w:r>
+              <w:rPr>
+                <w:rFonts w:ascii="Malgun Gothic" w:hAnsi="Malgun Gothic" w:eastAsia="Malgun Gothic"/>
+                <w:b w:val="0"/>
+                <w:i w:val="0"/>
+                <w:color w:val="1F2933"/>
+                <w:sz w:val="16"/>
+              </w:rPr>
+              <w:t>보관장소 고유기호·위치목록 처리부</w:t>
+            </w:r>
+          </w:p>
+        </w:tc>
+        <w:tc>
+          <w:tcPr>
+            <w:tcW w:type="dxa" w:w="835"/>
+            <w:shd w:fill="F7F9FA"/>
+            <w:vAlign w:val="center"/>
+            <w:tcMar>
+              <w:top w:w="90" w:type="dxa"/>
+              <w:left w:w="120" w:type="dxa"/>
+              <w:bottom w:w="90" w:type="dxa"/>
+              <w:right w:w="120" w:type="dxa"/>
+            </w:tcMar>
+          </w:tcPr>
+          <w:p>
+            <w:pPr>
+              <w:spacing w:before="0" w:after="0" w:line="269" w:lineRule="auto"/>
+              <w:jc w:val="left"/>
+            </w:pPr>
+            <w:r/>
+            <w:r>
+              <w:rPr>
+                <w:rFonts w:ascii="Malgun Gothic" w:hAnsi="Malgun Gothic" w:eastAsia="Malgun Gothic"/>
+                <w:b w:val="0"/>
+                <w:i w:val="0"/>
+                <w:color w:val="1F2933"/>
+                <w:sz w:val="16"/>
+              </w:rPr>
+            </w:r>
+          </w:p>
+        </w:tc>
+        <w:tc>
+          <w:tcPr>
+            <w:tcW w:type="dxa" w:w="4017"/>
+            <w:shd w:fill="F7F9FA"/>
+            <w:vAlign w:val="center"/>
+            <w:tcMar>
+              <w:top w:w="90" w:type="dxa"/>
+              <w:left w:w="120" w:type="dxa"/>
+              <w:bottom w:w="90" w:type="dxa"/>
+              <w:right w:w="120" w:type="dxa"/>
+            </w:tcMar>
+          </w:tcPr>
+          <w:p>
+            <w:pPr>
+              <w:spacing w:before="0" w:after="0" w:line="269" w:lineRule="auto"/>
+              <w:jc w:val="left"/>
+            </w:pPr>
+            <w:r/>
+            <w:r>
+              <w:rPr>
+                <w:rFonts w:ascii="Malgun Gothic" w:hAnsi="Malgun Gothic" w:eastAsia="Malgun Gothic"/>
+                <w:b w:val="0"/>
+                <w:i w:val="0"/>
+                <w:color w:val="1F2933"/>
+                <w:sz w:val="16"/>
+              </w:rPr>
+            </w:r>
+          </w:p>
+        </w:tc>
+      </w:tr>
+      <w:tr>
+        <w:tc>
+          <w:tcPr>
+            <w:tcW w:type="dxa" w:w="835"/>
+            <w:vAlign w:val="center"/>
+            <w:tcMar>
+              <w:top w:w="90" w:type="dxa"/>
+              <w:left w:w="120" w:type="dxa"/>
+              <w:bottom w:w="90" w:type="dxa"/>
+              <w:right w:w="120" w:type="dxa"/>
+            </w:tcMar>
+          </w:tcPr>
+          <w:p>
+            <w:pPr>
+              <w:spacing w:before="0" w:after="0" w:line="269" w:lineRule="auto"/>
+              <w:jc w:val="center"/>
+            </w:pPr>
+            <w:r/>
+            <w:r>
+              <w:rPr>
+                <w:rFonts w:ascii="Malgun Gothic" w:hAnsi="Malgun Gothic" w:eastAsia="Malgun Gothic"/>
+                <w:b w:val="0"/>
+                <w:i w:val="0"/>
+                <w:color w:val="1F2933"/>
+                <w:sz w:val="16"/>
+              </w:rPr>
+              <w:t>2110~2130</w:t>
+            </w:r>
+          </w:p>
+        </w:tc>
+        <w:tc>
+          <w:tcPr>
+            <w:tcW w:type="dxa" w:w="4017"/>
+            <w:vAlign w:val="center"/>
+            <w:tcMar>
+              <w:top w:w="90" w:type="dxa"/>
+              <w:left w:w="120" w:type="dxa"/>
+              <w:bottom w:w="90" w:type="dxa"/>
+              <w:right w:w="120" w:type="dxa"/>
+            </w:tcMar>
+          </w:tcPr>
+          <w:p>
+            <w:pPr>
+              <w:spacing w:before="0" w:after="0" w:line="269" w:lineRule="auto"/>
+              <w:jc w:val="left"/>
+            </w:pPr>
+            <w:r/>
+            <w:r>
+              <w:rPr>
+                <w:rFonts w:ascii="Malgun Gothic" w:hAnsi="Malgun Gothic" w:eastAsia="Malgun Gothic"/>
+                <w:b w:val="0"/>
+                <w:i w:val="0"/>
+                <w:color w:val="1F2933"/>
+                <w:sz w:val="16"/>
+              </w:rPr>
+              <w:t>라벨 최종본 저장·재주입부</w:t>
+            </w:r>
+          </w:p>
+        </w:tc>
+        <w:tc>
+          <w:tcPr>
+            <w:tcW w:type="dxa" w:w="835"/>
+            <w:vAlign w:val="center"/>
+            <w:tcMar>
+              <w:top w:w="90" w:type="dxa"/>
+              <w:left w:w="120" w:type="dxa"/>
+              <w:bottom w:w="90" w:type="dxa"/>
+              <w:right w:w="120" w:type="dxa"/>
+            </w:tcMar>
+          </w:tcPr>
+          <w:p>
+            <w:pPr>
+              <w:spacing w:before="0" w:after="0" w:line="269" w:lineRule="auto"/>
+              <w:jc w:val="left"/>
+            </w:pPr>
+            <w:r/>
+            <w:r>
+              <w:rPr>
+                <w:rFonts w:ascii="Malgun Gothic" w:hAnsi="Malgun Gothic" w:eastAsia="Malgun Gothic"/>
+                <w:b w:val="0"/>
+                <w:i w:val="0"/>
+                <w:color w:val="1F2933"/>
+                <w:sz w:val="16"/>
+              </w:rPr>
+            </w:r>
+          </w:p>
+        </w:tc>
+        <w:tc>
+          <w:tcPr>
+            <w:tcW w:type="dxa" w:w="4017"/>
+            <w:vAlign w:val="center"/>
+            <w:tcMar>
+              <w:top w:w="90" w:type="dxa"/>
+              <w:left w:w="120" w:type="dxa"/>
+              <w:bottom w:w="90" w:type="dxa"/>
+              <w:right w:w="120" w:type="dxa"/>
+            </w:tcMar>
+          </w:tcPr>
+          <w:p>
+            <w:pPr>
+              <w:spacing w:before="0" w:after="0" w:line="269" w:lineRule="auto"/>
+              <w:jc w:val="left"/>
+            </w:pPr>
+            <w:r/>
+            <w:r>
+              <w:rPr>
+                <w:rFonts w:ascii="Malgun Gothic" w:hAnsi="Malgun Gothic" w:eastAsia="Malgun Gothic"/>
+                <w:b w:val="0"/>
+                <w:i w:val="0"/>
+                <w:color w:val="1F2933"/>
+                <w:sz w:val="16"/>
+              </w:rPr>
+            </w:r>
+          </w:p>
+        </w:tc>
+      </w:tr>
+      <w:tr>
+        <w:tc>
+          <w:tcPr>
+            <w:tcW w:type="dxa" w:w="835"/>
+            <w:shd w:fill="F7F9FA"/>
+            <w:vAlign w:val="center"/>
+            <w:tcMar>
+              <w:top w:w="90" w:type="dxa"/>
+              <w:left w:w="120" w:type="dxa"/>
+              <w:bottom w:w="90" w:type="dxa"/>
+              <w:right w:w="120" w:type="dxa"/>
+            </w:tcMar>
+          </w:tcPr>
+          <w:p>
+            <w:pPr>
+              <w:spacing w:before="0" w:after="0" w:line="269" w:lineRule="auto"/>
+              <w:jc w:val="center"/>
+            </w:pPr>
+            <w:r/>
+            <w:r>
+              <w:rPr>
+                <w:rFonts w:ascii="Malgun Gothic" w:hAnsi="Malgun Gothic" w:eastAsia="Malgun Gothic"/>
+                <w:b w:val="0"/>
+                <w:i w:val="0"/>
+                <w:color w:val="1F2933"/>
+                <w:sz w:val="16"/>
+              </w:rPr>
+              <w:t>2210~2260</w:t>
+            </w:r>
+          </w:p>
+        </w:tc>
+        <w:tc>
+          <w:tcPr>
+            <w:tcW w:type="dxa" w:w="4017"/>
+            <w:shd w:fill="F7F9FA"/>
+            <w:vAlign w:val="center"/>
+            <w:tcMar>
+              <w:top w:w="90" w:type="dxa"/>
+              <w:left w:w="120" w:type="dxa"/>
+              <w:bottom w:w="90" w:type="dxa"/>
+              <w:right w:w="120" w:type="dxa"/>
+            </w:tcMar>
+          </w:tcPr>
+          <w:p>
+            <w:pPr>
+              <w:spacing w:before="0" w:after="0" w:line="269" w:lineRule="auto"/>
+              <w:jc w:val="left"/>
+            </w:pPr>
+            <w:r/>
+            <w:r>
+              <w:rPr>
+                <w:rFonts w:ascii="Malgun Gothic" w:hAnsi="Malgun Gothic" w:eastAsia="Malgun Gothic"/>
+                <w:b w:val="0"/>
+                <w:i w:val="0"/>
+                <w:color w:val="1F2933"/>
+                <w:sz w:val="16"/>
+              </w:rPr>
+              <w:t>역할별 배포·백업·복구부</w:t>
+            </w:r>
+          </w:p>
+        </w:tc>
+        <w:tc>
+          <w:tcPr>
+            <w:tcW w:type="dxa" w:w="835"/>
+            <w:shd w:fill="F7F9FA"/>
+            <w:vAlign w:val="center"/>
+            <w:tcMar>
+              <w:top w:w="90" w:type="dxa"/>
+              <w:left w:w="120" w:type="dxa"/>
+              <w:bottom w:w="90" w:type="dxa"/>
+              <w:right w:w="120" w:type="dxa"/>
+            </w:tcMar>
+          </w:tcPr>
+          <w:p>
+            <w:pPr>
+              <w:spacing w:before="0" w:after="0" w:line="269" w:lineRule="auto"/>
+              <w:jc w:val="left"/>
+            </w:pPr>
+            <w:r/>
+            <w:r>
+              <w:rPr>
+                <w:rFonts w:ascii="Malgun Gothic" w:hAnsi="Malgun Gothic" w:eastAsia="Malgun Gothic"/>
+                <w:b w:val="0"/>
+                <w:i w:val="0"/>
+                <w:color w:val="1F2933"/>
+                <w:sz w:val="16"/>
+              </w:rPr>
+            </w:r>
+          </w:p>
+        </w:tc>
+        <w:tc>
+          <w:tcPr>
+            <w:tcW w:type="dxa" w:w="4017"/>
+            <w:shd w:fill="F7F9FA"/>
+            <w:vAlign w:val="center"/>
+            <w:tcMar>
+              <w:top w:w="90" w:type="dxa"/>
+              <w:left w:w="120" w:type="dxa"/>
+              <w:bottom w:w="90" w:type="dxa"/>
+              <w:right w:w="120" w:type="dxa"/>
+            </w:tcMar>
+          </w:tcPr>
+          <w:p>
+            <w:pPr>
+              <w:spacing w:before="0" w:after="0" w:line="269" w:lineRule="auto"/>
+              <w:jc w:val="left"/>
+            </w:pPr>
+            <w:r/>
+            <w:r>
+              <w:rPr>
+                <w:rFonts w:ascii="Malgun Gothic" w:hAnsi="Malgun Gothic" w:eastAsia="Malgun Gothic"/>
+                <w:b w:val="0"/>
+                <w:i w:val="0"/>
+                <w:color w:val="1F2933"/>
+                <w:sz w:val="16"/>
+              </w:rPr>
+            </w:r>
+          </w:p>
+        </w:tc>
+      </w:tr>
+      <w:tr>
+        <w:tc>
+          <w:tcPr>
+            <w:tcW w:type="dxa" w:w="835"/>
+            <w:vAlign w:val="center"/>
+            <w:tcMar>
+              <w:top w:w="90" w:type="dxa"/>
+              <w:left w:w="120" w:type="dxa"/>
+              <w:bottom w:w="90" w:type="dxa"/>
+              <w:right w:w="120" w:type="dxa"/>
+            </w:tcMar>
+          </w:tcPr>
+          <w:p>
+            <w:pPr>
+              <w:spacing w:before="0" w:after="0" w:line="269" w:lineRule="auto"/>
+              <w:jc w:val="center"/>
+            </w:pPr>
+            <w:r/>
+            <w:r>
+              <w:rPr>
+                <w:rFonts w:ascii="Malgun Gothic" w:hAnsi="Malgun Gothic" w:eastAsia="Malgun Gothic"/>
+                <w:b w:val="0"/>
+                <w:i w:val="0"/>
+                <w:color w:val="1F2933"/>
+                <w:sz w:val="16"/>
+              </w:rPr>
+              <w:t>2310~2340</w:t>
+            </w:r>
+          </w:p>
+        </w:tc>
+        <w:tc>
+          <w:tcPr>
+            <w:tcW w:type="dxa" w:w="4017"/>
+            <w:vAlign w:val="center"/>
+            <w:tcMar>
+              <w:top w:w="90" w:type="dxa"/>
+              <w:left w:w="120" w:type="dxa"/>
+              <w:bottom w:w="90" w:type="dxa"/>
+              <w:right w:w="120" w:type="dxa"/>
+            </w:tcMar>
+          </w:tcPr>
+          <w:p>
+            <w:pPr>
+              <w:spacing w:before="0" w:after="0" w:line="269" w:lineRule="auto"/>
+              <w:jc w:val="left"/>
+            </w:pPr>
+            <w:r/>
+            <w:r>
+              <w:rPr>
+                <w:rFonts w:ascii="Malgun Gothic" w:hAnsi="Malgun Gothic" w:eastAsia="Malgun Gothic"/>
+                <w:b w:val="0"/>
+                <w:i w:val="0"/>
+                <w:color w:val="1F2933"/>
+                <w:sz w:val="16"/>
+              </w:rPr>
+              <w:t>카메라 라벨인식 위치검색부</w:t>
+            </w:r>
+          </w:p>
+        </w:tc>
+        <w:tc>
+          <w:tcPr>
+            <w:tcW w:type="dxa" w:w="835"/>
+            <w:vAlign w:val="center"/>
+            <w:tcMar>
+              <w:top w:w="90" w:type="dxa"/>
+              <w:left w:w="120" w:type="dxa"/>
+              <w:bottom w:w="90" w:type="dxa"/>
+              <w:right w:w="120" w:type="dxa"/>
+            </w:tcMar>
+          </w:tcPr>
+          <w:p>
+            <w:pPr>
+              <w:spacing w:before="0" w:after="0" w:line="269" w:lineRule="auto"/>
+              <w:jc w:val="left"/>
+            </w:pPr>
+            <w:r/>
+            <w:r>
+              <w:rPr>
+                <w:rFonts w:ascii="Malgun Gothic" w:hAnsi="Malgun Gothic" w:eastAsia="Malgun Gothic"/>
+                <w:b w:val="0"/>
+                <w:i w:val="0"/>
+                <w:color w:val="1F2933"/>
+                <w:sz w:val="16"/>
+              </w:rPr>
+            </w:r>
+          </w:p>
+        </w:tc>
+        <w:tc>
+          <w:tcPr>
+            <w:tcW w:type="dxa" w:w="4017"/>
+            <w:vAlign w:val="center"/>
+            <w:tcMar>
+              <w:top w:w="90" w:type="dxa"/>
+              <w:left w:w="120" w:type="dxa"/>
+              <w:bottom w:w="90" w:type="dxa"/>
+              <w:right w:w="120" w:type="dxa"/>
+            </w:tcMar>
+          </w:tcPr>
+          <w:p>
+            <w:pPr>
+              <w:spacing w:before="0" w:after="0" w:line="269" w:lineRule="auto"/>
+              <w:jc w:val="left"/>
+            </w:pPr>
+            <w:r/>
+            <w:r>
+              <w:rPr>
+                <w:rFonts w:ascii="Malgun Gothic" w:hAnsi="Malgun Gothic" w:eastAsia="Malgun Gothic"/>
+                <w:b w:val="0"/>
+                <w:i w:val="0"/>
+                <w:color w:val="1F2933"/>
+                <w:sz w:val="16"/>
+              </w:rPr>
+            </w:r>
+          </w:p>
+        </w:tc>
+      </w:tr>
     </w:tbl>
     <w:p>
       <w:r>
@@ -16461,7 +18635,7 @@
                 <w:color w:val="1F2933"/>
                 <w:sz w:val="19"/>
               </w:rPr>
-              <w:t>본 발명은 의약품 마스터의 변경과 실 배정을 병원 약제 업무 데이터에 자동 전파하는 통합 시스템 및 방법에 관한 것입니다. 시스템은 약제팀 보유약품목록 Excel을 단일 운영 원천으로 사용하면서 행 변경과 앱 승인 변경을 양방향 반영합니다. 실·약품·수량의 1회 배정은 전체 약품목록, 실별 목록·라벨 및 마약류 LOT 입력키를 함께 생성하며, 병동용·약제팀용 라벨은 공통 필드와 개별 필드를 분리하여 갱신됩니다. 순회점검에서는 부서상태를 미점검·점검유예·점검완료로 관리하고 더블 터치로 유예표시를 저장한 뒤 체크리스트 완료 시 자동 해제합니다. 체크리스트는 적합을 기본값으로 하여 개선필요 항목과 3개월 미만 유효기간 예외만 결과 레코드로 생성하고 순회점검 결과표와 보고서를 자동완성합니다. 모든 결과는 하나의 버전으로 커밋되어 역할별 PC와 모바일에 동기화됩니다.</w:t>
+              <w:t>본 발명은 의약품 마스터 변경과 비치 약품 보유 실 배정을 전체 목록·실별 목록·업무영역별 라벨·점검 증빙에 자동 전파하는 병원 약제 업무 통합 시스템 및 방법에 관한 것입니다. 약제팀 보유약품목록 Excel의 행 변경과 앱 승인 변경을 양방향 반영하고, 1회 실 배정으로 목록·라벨·마약류 LOT 입력키를 함께 생성합니다. 순회점검에서는 대상 실 버튼으로 점검완료·미점검·점검유예와 누락 부서를 먼저 확인한 후, 연계 프로그램에서 내려받은 예상 LOT와 현장 실제 LOT·수량·유효기간을 대조합니다. 체크리스트의 개선필요 항목과 3개월 미만 유효기간 예외는 결과표와 보고서에 자동 삽입됩니다. 보유 실과 구별되는 보관장소 고유기호는 위치표시 라벨, 위치별 약품장 목록 및 양방향 검색을 생성하고, 저장된 라벨 최종본에는 최신 마스터 종속필드가 재주입됩니다. 검증된 결과는 역할별 PC와 모바일에 동기화되며 분리된 버전과 이중 백업으로 복구됩니다.</w:t>
             </w:r>
           </w:p>
         </w:tc>

</xml_diff>